<commit_message>
perbaikan layout Astriani Komeri (format-2 docx) selesai, hanya perlu perbaiki langkah kerjanya saja
</commit_message>
<xml_diff>
--- a/kuliah/DocumentGenerator_Laporan_Praktikum/src/templates/format-2.docx
+++ b/kuliah/DocumentGenerator_Laporan_Praktikum/src/templates/format-2.docx
@@ -3228,7 +3228,8 @@
     <w:p>
       <w:pPr>
         <w:pStyle w:val="Text"/>
-        <w:ind w:left="1021"/>
+        <w:spacing w:after="0"/>
+        <w:ind w:left="964"/>
       </w:pPr>
       <w:r>
         <w:t xml:space="preserve">{% if </w:t>
@@ -3261,6 +3262,7 @@
     <w:p>
       <w:pPr>
         <w:pStyle w:val="Code"/>
+        <w:spacing w:after="0"/>
         <w:ind w:left="1134"/>
         <w:jc w:val="left"/>
       </w:pPr>
@@ -3279,6 +3281,7 @@
     <w:p>
       <w:pPr>
         <w:pStyle w:val="Text"/>
+        <w:spacing w:after="0"/>
         <w:ind w:left="1021"/>
       </w:pPr>
       <w:r>
@@ -3296,6 +3299,7 @@
     <w:p>
       <w:pPr>
         <w:pStyle w:val="Text"/>
+        <w:spacing w:after="0"/>
         <w:ind w:left="1021"/>
       </w:pPr>
       <w:r>
@@ -3313,6 +3317,7 @@
     <w:p>
       <w:pPr>
         <w:pStyle w:val="Text"/>
+        <w:spacing w:after="0"/>
         <w:ind w:left="1021"/>
       </w:pPr>
       <w:r>
@@ -3324,7 +3329,7 @@
       </w:r>
       <w:proofErr w:type="spellEnd"/>
       <w:r>
-        <w:t xml:space="preserve"> %} {% endif %}</w:t>
+        <w:t xml:space="preserve"> %}{% endif %}</w:t>
       </w:r>
     </w:p>
     <w:p>
@@ -3334,6 +3339,7 @@
           <w:ilvl w:val="0"/>
           <w:numId w:val="0"/>
         </w:numPr>
+        <w:spacing w:before="240"/>
         <w:ind w:left="510" w:hanging="153"/>
       </w:pPr>
       <w:r>
@@ -3432,6 +3438,8 @@
     <w:p>
       <w:pPr>
         <w:pStyle w:val="captions"/>
+        <w:spacing w:after="240"/>
+        <w:ind w:left="1077"/>
       </w:pPr>
       <w:bookmarkStart w:id="2" w:name="_Toc221452899"/>
       <w:r>
@@ -3487,6 +3495,7 @@
     <w:p>
       <w:pPr>
         <w:pStyle w:val="Text"/>
+        <w:spacing w:after="0"/>
         <w:ind w:left="1021"/>
       </w:pPr>
       <w:r>
@@ -3504,6 +3513,7 @@
     <w:p>
       <w:pPr>
         <w:pStyle w:val="Text"/>
+        <w:spacing w:after="240"/>
         <w:ind w:left="1021"/>
       </w:pPr>
       <w:r>
@@ -3521,6 +3531,7 @@
     <w:p>
       <w:pPr>
         <w:pStyle w:val="Text"/>
+        <w:spacing w:after="0"/>
         <w:ind w:left="1021"/>
       </w:pPr>
       <w:r>
@@ -3872,7 +3883,6 @@
         <w:ind w:left="663" w:hanging="153"/>
       </w:pPr>
       <w:r>
-        <w:lastRenderedPageBreak/>
         <w:t>II</w:t>
       </w:r>
       <w:r>
@@ -3899,6 +3909,7 @@
         <w:jc w:val="left"/>
       </w:pPr>
       <w:r>
+        <w:lastRenderedPageBreak/>
         <w:t>{% if item.</w:t>
       </w:r>
       <w:proofErr w:type="spellStart"/>
@@ -3922,6 +3933,7 @@
     <w:p>
       <w:pPr>
         <w:pStyle w:val="Code"/>
+        <w:spacing w:after="0"/>
         <w:ind w:left="1366"/>
         <w:jc w:val="left"/>
       </w:pPr>
@@ -4140,6 +4152,7 @@
     </w:p>
     <w:p>
       <w:pPr>
+        <w:spacing w:after="240"/>
         <w:ind w:left="1247"/>
       </w:pPr>
       <w:r>
@@ -4208,6 +4221,9 @@
       </w:r>
     </w:p>
     <w:p>
+      <w:pPr>
+        <w:spacing w:after="240"/>
+      </w:pPr>
       <w:r>
         <w:t>{{ item.teks }}</w:t>
       </w:r>

</xml_diff>

<commit_message>
perbaikan llangkah kerja bab 1 layout Astriani Komeri (format-2 docx) selesai
</commit_message>
<xml_diff>
--- a/kuliah/DocumentGenerator_Laporan_Praktikum/src/templates/format-2.docx
+++ b/kuliah/DocumentGenerator_Laporan_Praktikum/src/templates/format-2.docx
@@ -37,27 +37,7 @@
           <w:szCs w:val="28"/>
           <w:lang w:val="en-US"/>
         </w:rPr>
-        <w:t xml:space="preserve">{{ </w:t>
-      </w:r>
-      <w:proofErr w:type="spellStart"/>
-      <w:r>
-        <w:rPr>
-          <w:b/>
-          <w:sz w:val="28"/>
-          <w:szCs w:val="28"/>
-          <w:lang w:val="en-US"/>
-        </w:rPr>
-        <w:t>mata_kuliah</w:t>
-      </w:r>
-      <w:proofErr w:type="spellEnd"/>
-      <w:r>
-        <w:rPr>
-          <w:b/>
-          <w:sz w:val="28"/>
-          <w:szCs w:val="28"/>
-          <w:lang w:val="en-US"/>
-        </w:rPr>
-        <w:t xml:space="preserve"> }}</w:t>
+        <w:t>{{ mata_kuliah }}</w:t>
       </w:r>
     </w:p>
     <w:p>
@@ -110,27 +90,7 @@
           <w:szCs w:val="28"/>
           <w:lang w:val="en-US"/>
         </w:rPr>
-        <w:t xml:space="preserve">{{ </w:t>
-      </w:r>
-      <w:proofErr w:type="spellStart"/>
-      <w:r>
-        <w:rPr>
-          <w:b/>
-          <w:sz w:val="28"/>
-          <w:szCs w:val="28"/>
-          <w:lang w:val="en-US"/>
-        </w:rPr>
-        <w:t>nomor_modul</w:t>
-      </w:r>
-      <w:proofErr w:type="spellEnd"/>
-      <w:r>
-        <w:rPr>
-          <w:b/>
-          <w:sz w:val="28"/>
-          <w:szCs w:val="28"/>
-          <w:lang w:val="en-US"/>
-        </w:rPr>
-        <w:t xml:space="preserve"> }}</w:t>
+        <w:t>{{ nomor_modul }}</w:t>
       </w:r>
     </w:p>
     <w:p>
@@ -150,27 +110,7 @@
           <w:szCs w:val="28"/>
           <w:lang w:val="en-US"/>
         </w:rPr>
-        <w:t xml:space="preserve">{{ </w:t>
-      </w:r>
-      <w:proofErr w:type="spellStart"/>
-      <w:r>
-        <w:rPr>
-          <w:b/>
-          <w:sz w:val="28"/>
-          <w:szCs w:val="28"/>
-          <w:lang w:val="en-US"/>
-        </w:rPr>
-        <w:t>judul</w:t>
-      </w:r>
-      <w:proofErr w:type="spellEnd"/>
-      <w:r>
-        <w:rPr>
-          <w:b/>
-          <w:sz w:val="28"/>
-          <w:szCs w:val="28"/>
-          <w:lang w:val="en-US"/>
-        </w:rPr>
-        <w:t xml:space="preserve"> }}</w:t>
+        <w:t>{{ judul }}</w:t>
       </w:r>
     </w:p>
     <w:p>
@@ -3127,25 +3067,7 @@
           <w:szCs w:val="34"/>
           <w:lang w:val="en-US"/>
         </w:rPr>
-        <w:t xml:space="preserve">{% for item in </w:t>
-      </w:r>
-      <w:proofErr w:type="spellStart"/>
-      <w:r>
-        <w:rPr>
-          <w:sz w:val="34"/>
-          <w:szCs w:val="34"/>
-          <w:lang w:val="en-US"/>
-        </w:rPr>
-        <w:t>daftar_sub_bab</w:t>
-      </w:r>
-      <w:proofErr w:type="spellEnd"/>
-      <w:r>
-        <w:rPr>
-          <w:sz w:val="34"/>
-          <w:szCs w:val="34"/>
-          <w:lang w:val="en-US"/>
-        </w:rPr>
-        <w:t xml:space="preserve"> %}</w:t>
+        <w:t>{% for item in daftar_sub_bab %}</w:t>
       </w:r>
     </w:p>
     <w:p>
@@ -3161,23 +3083,7 @@
         <w:t>I</w:t>
       </w:r>
       <w:r>
-        <w:t xml:space="preserve">.{{ </w:t>
-      </w:r>
-      <w:proofErr w:type="spellStart"/>
-      <w:r>
-        <w:t>loop.index</w:t>
-      </w:r>
-      <w:proofErr w:type="spellEnd"/>
-      <w:r>
-        <w:t xml:space="preserve"> }} {{ </w:t>
-      </w:r>
-      <w:proofErr w:type="spellStart"/>
-      <w:r>
-        <w:t>item.judul_sub_bab</w:t>
-      </w:r>
-      <w:proofErr w:type="spellEnd"/>
-      <w:r>
-        <w:t xml:space="preserve"> }}</w:t>
+        <w:t>.{{ loop.index }} {{ item.judul_sub_bab }}</w:t>
       </w:r>
     </w:p>
     <w:p>
@@ -3211,15 +3117,7 @@
         <w:t xml:space="preserve"> </w:t>
       </w:r>
       <w:r>
-        <w:t xml:space="preserve">{{ </w:t>
-      </w:r>
-      <w:proofErr w:type="spellStart"/>
-      <w:r>
-        <w:t>item.label_point_a</w:t>
-      </w:r>
-      <w:proofErr w:type="spellEnd"/>
-      <w:r>
-        <w:t xml:space="preserve"> }}</w:t>
+        <w:t>{{ item.label_point_a }}</w:t>
       </w:r>
       <w:r>
         <w:t xml:space="preserve"> </w:t>
@@ -3227,109 +3125,65 @@
     </w:p>
     <w:p>
       <w:pPr>
-        <w:pStyle w:val="Text"/>
-        <w:spacing w:after="0"/>
         <w:ind w:left="964"/>
-      </w:pPr>
-      <w:r>
-        <w:t xml:space="preserve">{% if </w:t>
-      </w:r>
-      <w:proofErr w:type="spellStart"/>
-      <w:r>
-        <w:t>item.list_kode</w:t>
-      </w:r>
-      <w:proofErr w:type="spellEnd"/>
-      <w:r>
-        <w:t xml:space="preserve"> %}{% for k in </w:t>
-      </w:r>
-      <w:proofErr w:type="spellStart"/>
-      <w:r>
-        <w:t>item.list_kode</w:t>
-      </w:r>
-      <w:proofErr w:type="spellEnd"/>
-      <w:r>
-        <w:t xml:space="preserve"> %} {{ </w:t>
-      </w:r>
-      <w:proofErr w:type="spellStart"/>
-      <w:r>
-        <w:t>k.judul</w:t>
-      </w:r>
-      <w:proofErr w:type="spellEnd"/>
-      <w:r>
-        <w:t xml:space="preserve"> }}</w:t>
+        <w:jc w:val="left"/>
+      </w:pPr>
+      <w:r>
+        <w:t>{% if item.list_kode %}</w:t>
+      </w:r>
+      <w:r>
+        <w:t>{% for k in item.list_kode %}</w:t>
+      </w:r>
+      <w:r>
+        <w:t xml:space="preserve"> </w:t>
+      </w:r>
+      <w:r>
+        <w:t>{{ k.judul }}</w:t>
       </w:r>
     </w:p>
     <w:p>
       <w:pPr>
         <w:pStyle w:val="Code"/>
-        <w:spacing w:after="0"/>
-        <w:ind w:left="1134"/>
         <w:jc w:val="left"/>
       </w:pPr>
       <w:r>
-        <w:t xml:space="preserve">{{ </w:t>
-      </w:r>
-      <w:proofErr w:type="spellStart"/>
-      <w:r>
-        <w:t>k.isi</w:t>
-      </w:r>
-      <w:proofErr w:type="spellEnd"/>
-      <w:r>
-        <w:t xml:space="preserve"> }}</w:t>
+        <w:t>{{ k.isi }}</w:t>
       </w:r>
     </w:p>
     <w:p>
       <w:pPr>
-        <w:pStyle w:val="Text"/>
-        <w:spacing w:after="0"/>
         <w:ind w:left="1021"/>
       </w:pPr>
       <w:r>
-        <w:t xml:space="preserve">{% </w:t>
-      </w:r>
-      <w:proofErr w:type="spellStart"/>
-      <w:r>
-        <w:t>endfor</w:t>
-      </w:r>
-      <w:proofErr w:type="spellEnd"/>
-      <w:r>
-        <w:t xml:space="preserve"> %}</w:t>
+        <w:t>{% endfor %}</w:t>
       </w:r>
     </w:p>
     <w:p>
       <w:pPr>
-        <w:pStyle w:val="Text"/>
-        <w:spacing w:after="0"/>
-        <w:ind w:left="1021"/>
-      </w:pPr>
-      <w:r>
-        <w:t xml:space="preserve">{% else %}{% for baris in </w:t>
-      </w:r>
-      <w:proofErr w:type="spellStart"/>
-      <w:r>
-        <w:t>item.langkah_list</w:t>
-      </w:r>
-      <w:proofErr w:type="spellEnd"/>
-      <w:r>
-        <w:t xml:space="preserve"> %}</w:t>
+        <w:ind w:left="1378" w:hanging="357"/>
+      </w:pPr>
+      <w:r>
+        <w:t>{% else %}</w:t>
+      </w:r>
+      <w:r>
+        <w:t>{% for baris in item.isi_point_a %}</w:t>
       </w:r>
     </w:p>
     <w:p>
       <w:pPr>
-        <w:pStyle w:val="Text"/>
-        <w:spacing w:after="0"/>
-        <w:ind w:left="1021"/>
-      </w:pPr>
-      <w:r>
-        <w:t xml:space="preserve">{{ baris }} {% </w:t>
-      </w:r>
-      <w:proofErr w:type="spellStart"/>
-      <w:r>
-        <w:t>endfor</w:t>
-      </w:r>
-      <w:proofErr w:type="spellEnd"/>
-      <w:r>
-        <w:t xml:space="preserve"> %}{% endif %}</w:t>
+        <w:ind w:left="1378" w:hanging="357"/>
+      </w:pPr>
+      <w:r>
+        <w:t>{{ baris }}</w:t>
+      </w:r>
+      <w:r>
+        <w:t xml:space="preserve"> </w:t>
+      </w:r>
+      <w:r>
+        <w:t>{% endfor %}</w:t>
+      </w:r>
+      <w:r>
+        <w:t xml:space="preserve"> {% endif %}</w:t>
       </w:r>
     </w:p>
     <w:p>
@@ -3378,35 +3232,7 @@
         <w:rPr>
           <w:lang w:val="en-US"/>
         </w:rPr>
-        <w:t xml:space="preserve">{% for </w:t>
-      </w:r>
-      <w:proofErr w:type="spellStart"/>
-      <w:r>
-        <w:rPr>
-          <w:lang w:val="en-US"/>
-        </w:rPr>
-        <w:t>gbr</w:t>
-      </w:r>
-      <w:proofErr w:type="spellEnd"/>
-      <w:r>
-        <w:rPr>
-          <w:lang w:val="en-US"/>
-        </w:rPr>
-        <w:t xml:space="preserve"> in </w:t>
-      </w:r>
-      <w:proofErr w:type="spellStart"/>
-      <w:r>
-        <w:rPr>
-          <w:lang w:val="en-US"/>
-        </w:rPr>
-        <w:t>item.list_gambar</w:t>
-      </w:r>
-      <w:proofErr w:type="spellEnd"/>
-      <w:r>
-        <w:rPr>
-          <w:lang w:val="en-US"/>
-        </w:rPr>
-        <w:t xml:space="preserve"> %}</w:t>
+        <w:t>{% for gbr in item.list_gambar %}</w:t>
       </w:r>
       <w:r>
         <w:rPr>
@@ -3418,21 +3244,7 @@
         <w:rPr>
           <w:lang w:val="en-US"/>
         </w:rPr>
-        <w:t xml:space="preserve">{{ </w:t>
-      </w:r>
-      <w:proofErr w:type="spellStart"/>
-      <w:r>
-        <w:rPr>
-          <w:lang w:val="en-US"/>
-        </w:rPr>
-        <w:t>gbr.objek_gambar</w:t>
-      </w:r>
-      <w:proofErr w:type="spellEnd"/>
-      <w:r>
-        <w:rPr>
-          <w:lang w:val="en-US"/>
-        </w:rPr>
-        <w:t xml:space="preserve"> }}</w:t>
+        <w:t>{{ gbr.objek_gambar }}</w:t>
       </w:r>
     </w:p>
     <w:p>
@@ -3499,15 +3311,7 @@
         <w:ind w:left="1021"/>
       </w:pPr>
       <w:r>
-        <w:t xml:space="preserve">{% for p in </w:t>
-      </w:r>
-      <w:proofErr w:type="spellStart"/>
-      <w:r>
-        <w:t>item.list_paragraf_analisa</w:t>
-      </w:r>
-      <w:proofErr w:type="spellEnd"/>
-      <w:r>
-        <w:t xml:space="preserve"> %}</w:t>
+        <w:t>{% for p in item.list_paragraf_analisa %}</w:t>
       </w:r>
     </w:p>
     <w:p>
@@ -3517,15 +3321,7 @@
         <w:ind w:left="1021"/>
       </w:pPr>
       <w:r>
-        <w:t xml:space="preserve">{{ </w:t>
-      </w:r>
-      <w:proofErr w:type="spellStart"/>
-      <w:r>
-        <w:t>p.teks</w:t>
-      </w:r>
-      <w:proofErr w:type="spellEnd"/>
-      <w:r>
-        <w:t xml:space="preserve"> }}</w:t>
+        <w:t>{{ p.teks }}</w:t>
       </w:r>
     </w:p>
     <w:p>
@@ -3535,34 +3331,10 @@
         <w:ind w:left="1021"/>
       </w:pPr>
       <w:r>
-        <w:t xml:space="preserve">{% </w:t>
-      </w:r>
-      <w:proofErr w:type="spellStart"/>
-      <w:r>
-        <w:t>endfor</w:t>
-      </w:r>
-      <w:proofErr w:type="spellEnd"/>
-      <w:r>
-        <w:t xml:space="preserve"> %} {% </w:t>
-      </w:r>
-      <w:proofErr w:type="spellStart"/>
-      <w:r>
-        <w:t>endfor</w:t>
-      </w:r>
-      <w:proofErr w:type="spellEnd"/>
-      <w:r>
-        <w:t xml:space="preserve"> %}</w:t>
-      </w:r>
-      <w:r>
-        <w:t xml:space="preserve">{% if </w:t>
-      </w:r>
-      <w:proofErr w:type="spellStart"/>
-      <w:r>
-        <w:t>daftar_tugas|length</w:t>
-      </w:r>
-      <w:proofErr w:type="spellEnd"/>
-      <w:r>
-        <w:t xml:space="preserve"> == 0%}</w:t>
+        <w:t>{% endfor %} {% endfor %}</w:t>
+      </w:r>
+      <w:r>
+        <w:t>{% if daftar_tugas|length == 0%}</w:t>
       </w:r>
       <w:r>
         <w:t>{% else %}</w:t>
@@ -3576,14 +3348,9 @@
       <w:bookmarkStart w:id="3" w:name="_Toc197688616"/>
       <w:bookmarkStart w:id="4" w:name="_Toc147849649"/>
       <w:r>
-        <w:t xml:space="preserve">Tugas </w:t>
-      </w:r>
-      <w:proofErr w:type="spellStart"/>
-      <w:r>
-        <w:t>Praktikum</w:t>
+        <w:t>Tugas Praktikum</w:t>
       </w:r>
       <w:bookmarkEnd w:id="3"/>
-      <w:proofErr w:type="spellEnd"/>
     </w:p>
     <w:p>
       <w:pPr>
@@ -3595,21 +3362,7 @@
         <w:rPr>
           <w:lang w:val="en-US"/>
         </w:rPr>
-        <w:t xml:space="preserve">{% for item in </w:t>
-      </w:r>
-      <w:proofErr w:type="spellStart"/>
-      <w:r>
-        <w:rPr>
-          <w:lang w:val="en-US"/>
-        </w:rPr>
-        <w:t>daftar_tugas</w:t>
-      </w:r>
-      <w:proofErr w:type="spellEnd"/>
-      <w:r>
-        <w:rPr>
-          <w:lang w:val="en-US"/>
-        </w:rPr>
-        <w:t xml:space="preserve"> %}</w:t>
+        <w:t>{% for item in daftar_tugas %}</w:t>
       </w:r>
     </w:p>
     <w:p>
@@ -3628,23 +3381,7 @@
         <w:t xml:space="preserve"> </w:t>
       </w:r>
       <w:r>
-        <w:t xml:space="preserve">{{ </w:t>
-      </w:r>
-      <w:proofErr w:type="spellStart"/>
-      <w:r>
-        <w:t>loop.index</w:t>
-      </w:r>
-      <w:proofErr w:type="spellEnd"/>
-      <w:r>
-        <w:t xml:space="preserve"> }} {{ </w:t>
-      </w:r>
-      <w:proofErr w:type="spellStart"/>
-      <w:r>
-        <w:t>item.judul_sub_bab</w:t>
-      </w:r>
-      <w:proofErr w:type="spellEnd"/>
-      <w:r>
-        <w:t xml:space="preserve"> }}</w:t>
+        <w:t>{{ loop.index }} {{ item.judul_sub_bab }}</w:t>
       </w:r>
     </w:p>
     <w:p>
@@ -3658,49 +3395,7 @@
         <w:rPr>
           <w:lang w:val="en-US"/>
         </w:rPr>
-        <w:t xml:space="preserve">{% if </w:t>
-      </w:r>
-      <w:proofErr w:type="spellStart"/>
-      <w:r>
-        <w:rPr>
-          <w:lang w:val="en-US"/>
-        </w:rPr>
-        <w:t>item.tipe</w:t>
-      </w:r>
-      <w:proofErr w:type="spellEnd"/>
-      <w:r>
-        <w:rPr>
-          <w:lang w:val="en-US"/>
-        </w:rPr>
-        <w:t xml:space="preserve"> == “3” %}{% for </w:t>
-      </w:r>
-      <w:proofErr w:type="spellStart"/>
-      <w:r>
-        <w:rPr>
-          <w:lang w:val="en-US"/>
-        </w:rPr>
-        <w:t>qa</w:t>
-      </w:r>
-      <w:proofErr w:type="spellEnd"/>
-      <w:r>
-        <w:rPr>
-          <w:lang w:val="en-US"/>
-        </w:rPr>
-        <w:t xml:space="preserve"> in </w:t>
-      </w:r>
-      <w:proofErr w:type="spellStart"/>
-      <w:r>
-        <w:rPr>
-          <w:lang w:val="en-US"/>
-        </w:rPr>
-        <w:t>item.qa_list</w:t>
-      </w:r>
-      <w:proofErr w:type="spellEnd"/>
-      <w:r>
-        <w:rPr>
-          <w:lang w:val="en-US"/>
-        </w:rPr>
-        <w:t xml:space="preserve"> %}</w:t>
+        <w:t>{% if item.tipe == “3” %}{% for qa in item.qa_list %}</w:t>
       </w:r>
     </w:p>
     <w:tbl>
@@ -3741,23 +3436,13 @@
               </w:rPr>
               <w:t xml:space="preserve">{{ </w:t>
             </w:r>
-            <w:proofErr w:type="spellStart"/>
             <w:r>
               <w:rPr>
                 <w:sz w:val="2"/>
                 <w:szCs w:val="2"/>
                 <w:lang w:val="en-US"/>
               </w:rPr>
-              <w:t>loop.index</w:t>
-            </w:r>
-            <w:proofErr w:type="spellEnd"/>
-            <w:r>
-              <w:rPr>
-                <w:sz w:val="2"/>
-                <w:szCs w:val="2"/>
-                <w:lang w:val="en-US"/>
-              </w:rPr>
-              <w:t xml:space="preserve"> </w:t>
+              <w:t xml:space="preserve">loop.index </w:t>
             </w:r>
             <w:r>
               <w:rPr>
@@ -3782,21 +3467,7 @@
               <w:rPr>
                 <w:lang w:val="en-US"/>
               </w:rPr>
-              <w:t xml:space="preserve">{{ </w:t>
-            </w:r>
-            <w:proofErr w:type="spellStart"/>
-            <w:r>
-              <w:rPr>
-                <w:lang w:val="en-US"/>
-              </w:rPr>
-              <w:t>qa.q</w:t>
-            </w:r>
-            <w:proofErr w:type="spellEnd"/>
-            <w:r>
-              <w:rPr>
-                <w:lang w:val="en-US"/>
-              </w:rPr>
-              <w:t xml:space="preserve"> }}</w:t>
+              <w:t>{{ qa.q }}</w:t>
             </w:r>
           </w:p>
           <w:p>
@@ -3807,23 +3478,13 @@
                 <w:lang w:val="en-US"/>
               </w:rPr>
             </w:pPr>
-            <w:proofErr w:type="spellStart"/>
             <w:r>
               <w:rPr>
                 <w:b/>
                 <w:bCs/>
                 <w:lang w:val="en-US"/>
               </w:rPr>
-              <w:t>Jawaban</w:t>
-            </w:r>
-            <w:proofErr w:type="spellEnd"/>
-            <w:r>
-              <w:rPr>
-                <w:b/>
-                <w:bCs/>
-                <w:lang w:val="en-US"/>
-              </w:rPr>
-              <w:t>:</w:t>
+              <w:t>Jawaban:</w:t>
             </w:r>
           </w:p>
           <w:p>
@@ -3831,15 +3492,7 @@
               <w:pStyle w:val="Text"/>
             </w:pPr>
             <w:r>
-              <w:t xml:space="preserve">{{ </w:t>
-            </w:r>
-            <w:proofErr w:type="spellStart"/>
-            <w:r>
-              <w:t>qa.a</w:t>
-            </w:r>
-            <w:proofErr w:type="spellEnd"/>
-            <w:r>
-              <w:t xml:space="preserve"> }}</w:t>
+              <w:t>{{ qa.a }}</w:t>
             </w:r>
           </w:p>
         </w:tc>
@@ -3856,21 +3509,7 @@
         <w:rPr>
           <w:lang w:val="en-US"/>
         </w:rPr>
-        <w:t xml:space="preserve">{% </w:t>
-      </w:r>
-      <w:proofErr w:type="spellStart"/>
-      <w:r>
-        <w:rPr>
-          <w:lang w:val="en-US"/>
-        </w:rPr>
-        <w:t>endfor</w:t>
-      </w:r>
-      <w:proofErr w:type="spellEnd"/>
-      <w:r>
-        <w:rPr>
-          <w:lang w:val="en-US"/>
-        </w:rPr>
-        <w:t xml:space="preserve"> %}{% else %}</w:t>
+        <w:t>{% endfor %}{% else %}</w:t>
       </w:r>
     </w:p>
     <w:p>
@@ -3892,15 +3531,7 @@
         <w:t>.{{ loop.index }}.</w:t>
       </w:r>
       <w:r>
-        <w:t xml:space="preserve">A. {{ </w:t>
-      </w:r>
-      <w:proofErr w:type="spellStart"/>
-      <w:r>
-        <w:t>item.label_point_a</w:t>
-      </w:r>
-      <w:proofErr w:type="spellEnd"/>
-      <w:r>
-        <w:t xml:space="preserve"> }} </w:t>
+        <w:t xml:space="preserve">A. {{ item.label_point_a }} </w:t>
       </w:r>
     </w:p>
     <w:p>
@@ -3912,19 +3543,11 @@
         <w:lastRenderedPageBreak/>
         <w:t>{% if item.</w:t>
       </w:r>
-      <w:proofErr w:type="spellStart"/>
       <w:r>
         <w:rPr>
           <w:lang w:val="en-US"/>
         </w:rPr>
-        <w:t>tipe</w:t>
-      </w:r>
-      <w:proofErr w:type="spellEnd"/>
-      <w:r>
-        <w:rPr>
-          <w:lang w:val="en-US"/>
-        </w:rPr>
-        <w:t xml:space="preserve"> == “1” </w:t>
+        <w:t xml:space="preserve">tipe == “1” </w:t>
       </w:r>
       <w:r>
         <w:t>%}{% for k in item.list_kode %} {{ k.judul }}</w:t>
@@ -3938,15 +3561,7 @@
         <w:jc w:val="left"/>
       </w:pPr>
       <w:r>
-        <w:t xml:space="preserve">{{ </w:t>
-      </w:r>
-      <w:proofErr w:type="spellStart"/>
-      <w:r>
-        <w:t>k.isi</w:t>
-      </w:r>
-      <w:proofErr w:type="spellEnd"/>
-      <w:r>
-        <w:t xml:space="preserve"> }}</w:t>
+        <w:t>{{ k.isi }}</w:t>
       </w:r>
     </w:p>
     <w:p>
@@ -3977,14 +3592,12 @@
       <w:r>
         <w:t>%}{% for baris in item.</w:t>
       </w:r>
-      <w:proofErr w:type="spellStart"/>
       <w:r>
         <w:rPr>
           <w:lang w:val="en-US"/>
         </w:rPr>
         <w:t>langkah_list</w:t>
       </w:r>
-      <w:proofErr w:type="spellEnd"/>
       <w:r>
         <w:t xml:space="preserve"> %}</w:t>
       </w:r>
@@ -4026,15 +3639,7 @@
         <w:t>.{{ loop.index }}.</w:t>
       </w:r>
       <w:r>
-        <w:t xml:space="preserve">B. </w:t>
-      </w:r>
-      <w:proofErr w:type="spellStart"/>
-      <w:r>
-        <w:t>Tampilan</w:t>
-      </w:r>
-      <w:proofErr w:type="spellEnd"/>
-      <w:r>
-        <w:t xml:space="preserve"> Hasil </w:t>
+        <w:t xml:space="preserve">B. Tampilan Hasil </w:t>
       </w:r>
     </w:p>
     <w:p>
@@ -4048,49 +3653,7 @@
         <w:rPr>
           <w:lang w:val="en-US"/>
         </w:rPr>
-        <w:t xml:space="preserve">{% for </w:t>
-      </w:r>
-      <w:proofErr w:type="spellStart"/>
-      <w:r>
-        <w:rPr>
-          <w:lang w:val="en-US"/>
-        </w:rPr>
-        <w:t>gbr</w:t>
-      </w:r>
-      <w:proofErr w:type="spellEnd"/>
-      <w:r>
-        <w:rPr>
-          <w:lang w:val="en-US"/>
-        </w:rPr>
-        <w:t xml:space="preserve"> in </w:t>
-      </w:r>
-      <w:proofErr w:type="spellStart"/>
-      <w:r>
-        <w:rPr>
-          <w:lang w:val="en-US"/>
-        </w:rPr>
-        <w:t>item.list_gambar</w:t>
-      </w:r>
-      <w:proofErr w:type="spellEnd"/>
-      <w:r>
-        <w:rPr>
-          <w:lang w:val="en-US"/>
-        </w:rPr>
-        <w:t xml:space="preserve"> %} {{ </w:t>
-      </w:r>
-      <w:proofErr w:type="spellStart"/>
-      <w:r>
-        <w:rPr>
-          <w:lang w:val="en-US"/>
-        </w:rPr>
-        <w:t>gbr.objek_gambar</w:t>
-      </w:r>
-      <w:proofErr w:type="spellEnd"/>
-      <w:r>
-        <w:rPr>
-          <w:lang w:val="en-US"/>
-        </w:rPr>
-        <w:t xml:space="preserve"> }}</w:t>
+        <w:t>{% for gbr in item.list_gambar %} {{ gbr.objek_gambar }}</w:t>
       </w:r>
     </w:p>
     <w:p>
@@ -4173,21 +3736,7 @@
         <w:rPr>
           <w:lang w:val="en-US"/>
         </w:rPr>
-        <w:t xml:space="preserve"> {% endif %} {% </w:t>
-      </w:r>
-      <w:proofErr w:type="spellStart"/>
-      <w:r>
-        <w:rPr>
-          <w:lang w:val="en-US"/>
-        </w:rPr>
-        <w:t>endfor</w:t>
-      </w:r>
-      <w:proofErr w:type="spellEnd"/>
-      <w:r>
-        <w:rPr>
-          <w:lang w:val="en-US"/>
-        </w:rPr>
-        <w:t xml:space="preserve"> %}{% endif %}</w:t>
+        <w:t xml:space="preserve"> {% endif %} {% endfor %}{% endif %}</w:t>
       </w:r>
     </w:p>
     <w:p>

</xml_diff>

<commit_message>
memperbaiki template format 2 dan 3 menambahkan penjelasan singkat
</commit_message>
<xml_diff>
--- a/kuliah/DocumentGenerator_Laporan_Praktikum/src/templates/format-2.docx
+++ b/kuliah/DocumentGenerator_Laporan_Praktikum/src/templates/format-2.docx
@@ -1,6 +1,6 @@
 
 <file path=word/document.xml><?xml version="1.0" encoding="utf-8"?>
-<w:document xmlns:wpc="http://schemas.microsoft.com/office/word/2010/wordprocessingCanvas" xmlns:cx="http://schemas.microsoft.com/office/drawing/2014/chartex" xmlns:cx1="http://schemas.microsoft.com/office/drawing/2015/9/8/chartex" xmlns:cx2="http://schemas.microsoft.com/office/drawing/2015/10/21/chartex" xmlns:cx3="http://schemas.microsoft.com/office/drawing/2016/5/9/chartex" xmlns:cx4="http://schemas.microsoft.com/office/drawing/2016/5/10/chartex" xmlns:cx5="http://schemas.microsoft.com/office/drawing/2016/5/11/chartex" xmlns:cx6="http://schemas.microsoft.com/office/drawing/2016/5/12/chartex" xmlns:cx7="http://schemas.microsoft.com/office/drawing/2016/5/13/chartex" xmlns:cx8="http://schemas.microsoft.com/office/drawing/2016/5/14/chartex" xmlns:mc="http://schemas.openxmlformats.org/markup-compatibility/2006" xmlns:aink="http://schemas.microsoft.com/office/drawing/2016/ink" xmlns:am3d="http://schemas.microsoft.com/office/drawing/2017/model3d" xmlns:o="urn:schemas-microsoft-com:office:office" xmlns:oel="http://schemas.microsoft.com/office/2019/extlst" xmlns:r="http://schemas.openxmlformats.org/officeDocument/2006/relationships" xmlns:m="http://schemas.openxmlformats.org/officeDocument/2006/math" xmlns:v="urn:schemas-microsoft-com:vml" xmlns:wp14="http://schemas.microsoft.com/office/word/2010/wordprocessingDrawing" xmlns:wp="http://schemas.openxmlformats.org/drawingml/2006/wordprocessingDrawing" xmlns:w10="urn:schemas-microsoft-com:office:word" xmlns:w="http://schemas.openxmlformats.org/wordprocessingml/2006/main" xmlns:w14="http://schemas.microsoft.com/office/word/2010/wordml" xmlns:w15="http://schemas.microsoft.com/office/word/2012/wordml" xmlns:w16cex="http://schemas.microsoft.com/office/word/2018/wordml/cex" xmlns:w16cid="http://schemas.microsoft.com/office/word/2016/wordml/cid" xmlns:w16="http://schemas.microsoft.com/office/word/2018/wordml" xmlns:w16du="http://schemas.microsoft.com/office/word/2023/wordml/word16du" xmlns:w16sdtdh="http://schemas.microsoft.com/office/word/2020/wordml/sdtdatahash" xmlns:w16sdtfl="http://schemas.microsoft.com/office/word/2024/wordml/sdtformatlock" xmlns:w16se="http://schemas.microsoft.com/office/word/2015/wordml/symex" xmlns:wpg="http://schemas.microsoft.com/office/word/2010/wordprocessingGroup" xmlns:wpi="http://schemas.microsoft.com/office/word/2010/wordprocessingInk" xmlns:wne="http://schemas.microsoft.com/office/word/2006/wordml" xmlns:wps="http://schemas.microsoft.com/office/word/2010/wordprocessingShape" mc:Ignorable="w14 w15 w16se w16cid w16 w16cex w16sdtdh w16sdtfl w16du wp14">
+<w:document xmlns:wpc="http://schemas.microsoft.com/office/word/2010/wordprocessingCanvas" xmlns:cx="http://schemas.microsoft.com/office/drawing/2014/chartex" xmlns:cx1="http://schemas.microsoft.com/office/drawing/2015/9/8/chartex" xmlns:cx2="http://schemas.microsoft.com/office/drawing/2015/10/21/chartex" xmlns:cx3="http://schemas.microsoft.com/office/drawing/2016/5/9/chartex" xmlns:cx4="http://schemas.microsoft.com/office/drawing/2016/5/10/chartex" xmlns:cx5="http://schemas.microsoft.com/office/drawing/2016/5/11/chartex" xmlns:cx6="http://schemas.microsoft.com/office/drawing/2016/5/12/chartex" xmlns:cx7="http://schemas.microsoft.com/office/drawing/2016/5/13/chartex" xmlns:cx8="http://schemas.microsoft.com/office/drawing/2016/5/14/chartex" xmlns:mc="http://schemas.openxmlformats.org/markup-compatibility/2006" xmlns:aink="http://schemas.microsoft.com/office/drawing/2016/ink" xmlns:am3d="http://schemas.microsoft.com/office/drawing/2017/model3d" xmlns:o="urn:schemas-microsoft-com:office:office" xmlns:r="http://schemas.openxmlformats.org/officeDocument/2006/relationships" xmlns:m="http://schemas.openxmlformats.org/officeDocument/2006/math" xmlns:v="urn:schemas-microsoft-com:vml" xmlns:wp14="http://schemas.microsoft.com/office/word/2010/wordprocessingDrawing" xmlns:wp="http://schemas.openxmlformats.org/drawingml/2006/wordprocessingDrawing" xmlns:w10="urn:schemas-microsoft-com:office:word" xmlns:w="http://schemas.openxmlformats.org/wordprocessingml/2006/main" xmlns:w14="http://schemas.microsoft.com/office/word/2010/wordml" xmlns:w15="http://schemas.microsoft.com/office/word/2012/wordml" xmlns:w16cex="http://schemas.microsoft.com/office/word/2018/wordml/cex" xmlns:w16cid="http://schemas.microsoft.com/office/word/2016/wordml/cid" xmlns:w16="http://schemas.microsoft.com/office/word/2018/wordml" xmlns:w16se="http://schemas.microsoft.com/office/word/2015/wordml/symex" xmlns:wpg="http://schemas.microsoft.com/office/word/2010/wordprocessingGroup" xmlns:wpi="http://schemas.microsoft.com/office/word/2010/wordprocessingInk" xmlns:wne="http://schemas.microsoft.com/office/word/2006/wordml" xmlns:wps="http://schemas.microsoft.com/office/word/2010/wordprocessingShape" mc:Ignorable="w14 w15 w16se w16cid w16 w16cex wp14">
   <w:body>
     <w:p>
       <w:pPr>
@@ -2964,7 +2964,6 @@
       </w:pPr>
       <w:bookmarkStart w:id="0" w:name="_Toc197688582"/>
       <w:r>
-        <w:lastRenderedPageBreak/>
         <w:t>DAFTAR GAMBAR</w:t>
       </w:r>
       <w:bookmarkEnd w:id="0"/>
@@ -3048,7 +3047,6 @@
       </w:pPr>
       <w:bookmarkStart w:id="1" w:name="_Toc197688583"/>
       <w:r>
-        <w:lastRenderedPageBreak/>
         <w:t>HASIL PRAKTIKUM</w:t>
       </w:r>
       <w:bookmarkEnd w:id="1"/>
@@ -3084,6 +3082,48 @@
       </w:r>
       <w:r>
         <w:t>.{{ loop.index }} {{ item.judul_sub_bab }}</w:t>
+      </w:r>
+    </w:p>
+    <w:p>
+      <w:pPr>
+        <w:ind w:left="369"/>
+        <w:rPr>
+          <w:lang w:val="en-US"/>
+        </w:rPr>
+      </w:pPr>
+      <w:r>
+        <w:rPr>
+          <w:lang w:val="en-US"/>
+        </w:rPr>
+        <w:t>{% if item.penjelasan_singkat and item.penjelasan_singkat != "##HAPUS##" %}</w:t>
+      </w:r>
+    </w:p>
+    <w:p>
+      <w:pPr>
+        <w:ind w:left="369"/>
+        <w:rPr>
+          <w:lang w:val="en-US"/>
+        </w:rPr>
+      </w:pPr>
+      <w:r>
+        <w:rPr>
+          <w:lang w:val="en-US"/>
+        </w:rPr>
+        <w:t>{{ item.penjelasan_singkat }}</w:t>
+      </w:r>
+    </w:p>
+    <w:p>
+      <w:pPr>
+        <w:ind w:left="369"/>
+        <w:rPr>
+          <w:lang w:val="en-US"/>
+        </w:rPr>
+      </w:pPr>
+      <w:r>
+        <w:rPr>
+          <w:lang w:val="en-US"/>
+        </w:rPr>
+        <w:t>{% endif %}</w:t>
       </w:r>
     </w:p>
     <w:p>
@@ -3382,6 +3422,48 @@
       </w:r>
       <w:r>
         <w:t>{{ loop.index }} {{ item.judul_sub_bab }}</w:t>
+      </w:r>
+    </w:p>
+    <w:p>
+      <w:pPr>
+        <w:ind w:left="369"/>
+        <w:rPr>
+          <w:lang w:val="en-US"/>
+        </w:rPr>
+      </w:pPr>
+      <w:r>
+        <w:rPr>
+          <w:lang w:val="en-US"/>
+        </w:rPr>
+        <w:t>{% if item.penjelasan_singkat and item.penjelasan_singkat != "##HAPUS##" %}</w:t>
+      </w:r>
+    </w:p>
+    <w:p>
+      <w:pPr>
+        <w:ind w:left="369"/>
+        <w:rPr>
+          <w:lang w:val="en-US"/>
+        </w:rPr>
+      </w:pPr>
+      <w:r>
+        <w:rPr>
+          <w:lang w:val="en-US"/>
+        </w:rPr>
+        <w:t>{{ item.penjelasan_singkat }}</w:t>
+      </w:r>
+    </w:p>
+    <w:p>
+      <w:pPr>
+        <w:ind w:left="369"/>
+        <w:rPr>
+          <w:lang w:val="en-US"/>
+        </w:rPr>
+      </w:pPr>
+      <w:r>
+        <w:rPr>
+          <w:lang w:val="en-US"/>
+        </w:rPr>
+        <w:t>{% endif %}</w:t>
       </w:r>
     </w:p>
     <w:p>
@@ -3488,9 +3570,6 @@
             </w:r>
           </w:p>
           <w:p>
-            <w:pPr>
-              <w:pStyle w:val="Text"/>
-            </w:pPr>
             <w:r>
               <w:t>{{ qa.a }}</w:t>
             </w:r>
@@ -3540,7 +3619,6 @@
         <w:jc w:val="left"/>
       </w:pPr>
       <w:r>
-        <w:lastRenderedPageBreak/>
         <w:t>{% if item.</w:t>
       </w:r>
       <w:r>
@@ -3801,7 +3879,7 @@
 </file>
 
 <file path=word/endnotes.xml><?xml version="1.0" encoding="utf-8"?>
-<w:endnotes xmlns:wpc="http://schemas.microsoft.com/office/word/2010/wordprocessingCanvas" xmlns:cx="http://schemas.microsoft.com/office/drawing/2014/chartex" xmlns:cx1="http://schemas.microsoft.com/office/drawing/2015/9/8/chartex" xmlns:cx2="http://schemas.microsoft.com/office/drawing/2015/10/21/chartex" xmlns:cx3="http://schemas.microsoft.com/office/drawing/2016/5/9/chartex" xmlns:cx4="http://schemas.microsoft.com/office/drawing/2016/5/10/chartex" xmlns:cx5="http://schemas.microsoft.com/office/drawing/2016/5/11/chartex" xmlns:cx6="http://schemas.microsoft.com/office/drawing/2016/5/12/chartex" xmlns:cx7="http://schemas.microsoft.com/office/drawing/2016/5/13/chartex" xmlns:cx8="http://schemas.microsoft.com/office/drawing/2016/5/14/chartex" xmlns:mc="http://schemas.openxmlformats.org/markup-compatibility/2006" xmlns:aink="http://schemas.microsoft.com/office/drawing/2016/ink" xmlns:am3d="http://schemas.microsoft.com/office/drawing/2017/model3d" xmlns:o="urn:schemas-microsoft-com:office:office" xmlns:oel="http://schemas.microsoft.com/office/2019/extlst" xmlns:r="http://schemas.openxmlformats.org/officeDocument/2006/relationships" xmlns:m="http://schemas.openxmlformats.org/officeDocument/2006/math" xmlns:v="urn:schemas-microsoft-com:vml" xmlns:wp14="http://schemas.microsoft.com/office/word/2010/wordprocessingDrawing" xmlns:wp="http://schemas.openxmlformats.org/drawingml/2006/wordprocessingDrawing" xmlns:w10="urn:schemas-microsoft-com:office:word" xmlns:w="http://schemas.openxmlformats.org/wordprocessingml/2006/main" xmlns:w14="http://schemas.microsoft.com/office/word/2010/wordml" xmlns:w15="http://schemas.microsoft.com/office/word/2012/wordml" xmlns:w16cex="http://schemas.microsoft.com/office/word/2018/wordml/cex" xmlns:w16cid="http://schemas.microsoft.com/office/word/2016/wordml/cid" xmlns:w16="http://schemas.microsoft.com/office/word/2018/wordml" xmlns:w16du="http://schemas.microsoft.com/office/word/2023/wordml/word16du" xmlns:w16sdtdh="http://schemas.microsoft.com/office/word/2020/wordml/sdtdatahash" xmlns:w16sdtfl="http://schemas.microsoft.com/office/word/2024/wordml/sdtformatlock" xmlns:w16se="http://schemas.microsoft.com/office/word/2015/wordml/symex" xmlns:wpg="http://schemas.microsoft.com/office/word/2010/wordprocessingGroup" xmlns:wpi="http://schemas.microsoft.com/office/word/2010/wordprocessingInk" xmlns:wne="http://schemas.microsoft.com/office/word/2006/wordml" xmlns:wps="http://schemas.microsoft.com/office/word/2010/wordprocessingShape" mc:Ignorable="w14 w15 w16se w16cid w16 w16cex w16sdtdh w16sdtfl w16du wp14">
+<w:endnotes xmlns:wpc="http://schemas.microsoft.com/office/word/2010/wordprocessingCanvas" xmlns:cx="http://schemas.microsoft.com/office/drawing/2014/chartex" xmlns:cx1="http://schemas.microsoft.com/office/drawing/2015/9/8/chartex" xmlns:cx2="http://schemas.microsoft.com/office/drawing/2015/10/21/chartex" xmlns:cx3="http://schemas.microsoft.com/office/drawing/2016/5/9/chartex" xmlns:cx4="http://schemas.microsoft.com/office/drawing/2016/5/10/chartex" xmlns:cx5="http://schemas.microsoft.com/office/drawing/2016/5/11/chartex" xmlns:cx6="http://schemas.microsoft.com/office/drawing/2016/5/12/chartex" xmlns:cx7="http://schemas.microsoft.com/office/drawing/2016/5/13/chartex" xmlns:cx8="http://schemas.microsoft.com/office/drawing/2016/5/14/chartex" xmlns:mc="http://schemas.openxmlformats.org/markup-compatibility/2006" xmlns:aink="http://schemas.microsoft.com/office/drawing/2016/ink" xmlns:am3d="http://schemas.microsoft.com/office/drawing/2017/model3d" xmlns:o="urn:schemas-microsoft-com:office:office" xmlns:r="http://schemas.openxmlformats.org/officeDocument/2006/relationships" xmlns:m="http://schemas.openxmlformats.org/officeDocument/2006/math" xmlns:v="urn:schemas-microsoft-com:vml" xmlns:wp14="http://schemas.microsoft.com/office/word/2010/wordprocessingDrawing" xmlns:wp="http://schemas.openxmlformats.org/drawingml/2006/wordprocessingDrawing" xmlns:w10="urn:schemas-microsoft-com:office:word" xmlns:w="http://schemas.openxmlformats.org/wordprocessingml/2006/main" xmlns:w14="http://schemas.microsoft.com/office/word/2010/wordml" xmlns:w15="http://schemas.microsoft.com/office/word/2012/wordml" xmlns:w16cex="http://schemas.microsoft.com/office/word/2018/wordml/cex" xmlns:w16cid="http://schemas.microsoft.com/office/word/2016/wordml/cid" xmlns:w16="http://schemas.microsoft.com/office/word/2018/wordml" xmlns:w16se="http://schemas.microsoft.com/office/word/2015/wordml/symex" xmlns:wpg="http://schemas.microsoft.com/office/word/2010/wordprocessingGroup" xmlns:wpi="http://schemas.microsoft.com/office/word/2010/wordprocessingInk" xmlns:wne="http://schemas.microsoft.com/office/word/2006/wordml" xmlns:wps="http://schemas.microsoft.com/office/word/2010/wordprocessingShape" mc:Ignorable="w14 w15 w16se w16cid w16 w16cex wp14">
   <w:endnote w:type="separator" w:id="-1">
     <w:p>
       <w:pPr>
@@ -3828,7 +3906,7 @@
 </file>
 
 <file path=word/footer1.xml><?xml version="1.0" encoding="utf-8"?>
-<w:ftr xmlns:wpc="http://schemas.microsoft.com/office/word/2010/wordprocessingCanvas" xmlns:cx="http://schemas.microsoft.com/office/drawing/2014/chartex" xmlns:cx1="http://schemas.microsoft.com/office/drawing/2015/9/8/chartex" xmlns:cx2="http://schemas.microsoft.com/office/drawing/2015/10/21/chartex" xmlns:cx3="http://schemas.microsoft.com/office/drawing/2016/5/9/chartex" xmlns:cx4="http://schemas.microsoft.com/office/drawing/2016/5/10/chartex" xmlns:cx5="http://schemas.microsoft.com/office/drawing/2016/5/11/chartex" xmlns:cx6="http://schemas.microsoft.com/office/drawing/2016/5/12/chartex" xmlns:cx7="http://schemas.microsoft.com/office/drawing/2016/5/13/chartex" xmlns:cx8="http://schemas.microsoft.com/office/drawing/2016/5/14/chartex" xmlns:mc="http://schemas.openxmlformats.org/markup-compatibility/2006" xmlns:aink="http://schemas.microsoft.com/office/drawing/2016/ink" xmlns:am3d="http://schemas.microsoft.com/office/drawing/2017/model3d" xmlns:o="urn:schemas-microsoft-com:office:office" xmlns:oel="http://schemas.microsoft.com/office/2019/extlst" xmlns:r="http://schemas.openxmlformats.org/officeDocument/2006/relationships" xmlns:m="http://schemas.openxmlformats.org/officeDocument/2006/math" xmlns:v="urn:schemas-microsoft-com:vml" xmlns:wp14="http://schemas.microsoft.com/office/word/2010/wordprocessingDrawing" xmlns:wp="http://schemas.openxmlformats.org/drawingml/2006/wordprocessingDrawing" xmlns:w10="urn:schemas-microsoft-com:office:word" xmlns:w="http://schemas.openxmlformats.org/wordprocessingml/2006/main" xmlns:w14="http://schemas.microsoft.com/office/word/2010/wordml" xmlns:w15="http://schemas.microsoft.com/office/word/2012/wordml" xmlns:w16cex="http://schemas.microsoft.com/office/word/2018/wordml/cex" xmlns:w16cid="http://schemas.microsoft.com/office/word/2016/wordml/cid" xmlns:w16="http://schemas.microsoft.com/office/word/2018/wordml" xmlns:w16du="http://schemas.microsoft.com/office/word/2023/wordml/word16du" xmlns:w16sdtdh="http://schemas.microsoft.com/office/word/2020/wordml/sdtdatahash" xmlns:w16sdtfl="http://schemas.microsoft.com/office/word/2024/wordml/sdtformatlock" xmlns:w16se="http://schemas.microsoft.com/office/word/2015/wordml/symex" xmlns:wpg="http://schemas.microsoft.com/office/word/2010/wordprocessingGroup" xmlns:wpi="http://schemas.microsoft.com/office/word/2010/wordprocessingInk" xmlns:wne="http://schemas.microsoft.com/office/word/2006/wordml" xmlns:wps="http://schemas.microsoft.com/office/word/2010/wordprocessingShape" mc:Ignorable="w14 w15 w16se w16cid w16 w16cex w16sdtdh w16sdtfl w16du wp14">
+<w:ftr xmlns:wpc="http://schemas.microsoft.com/office/word/2010/wordprocessingCanvas" xmlns:cx="http://schemas.microsoft.com/office/drawing/2014/chartex" xmlns:cx1="http://schemas.microsoft.com/office/drawing/2015/9/8/chartex" xmlns:cx2="http://schemas.microsoft.com/office/drawing/2015/10/21/chartex" xmlns:cx3="http://schemas.microsoft.com/office/drawing/2016/5/9/chartex" xmlns:cx4="http://schemas.microsoft.com/office/drawing/2016/5/10/chartex" xmlns:cx5="http://schemas.microsoft.com/office/drawing/2016/5/11/chartex" xmlns:cx6="http://schemas.microsoft.com/office/drawing/2016/5/12/chartex" xmlns:cx7="http://schemas.microsoft.com/office/drawing/2016/5/13/chartex" xmlns:cx8="http://schemas.microsoft.com/office/drawing/2016/5/14/chartex" xmlns:mc="http://schemas.openxmlformats.org/markup-compatibility/2006" xmlns:aink="http://schemas.microsoft.com/office/drawing/2016/ink" xmlns:am3d="http://schemas.microsoft.com/office/drawing/2017/model3d" xmlns:o="urn:schemas-microsoft-com:office:office" xmlns:r="http://schemas.openxmlformats.org/officeDocument/2006/relationships" xmlns:m="http://schemas.openxmlformats.org/officeDocument/2006/math" xmlns:v="urn:schemas-microsoft-com:vml" xmlns:wp14="http://schemas.microsoft.com/office/word/2010/wordprocessingDrawing" xmlns:wp="http://schemas.openxmlformats.org/drawingml/2006/wordprocessingDrawing" xmlns:w10="urn:schemas-microsoft-com:office:word" xmlns:w="http://schemas.openxmlformats.org/wordprocessingml/2006/main" xmlns:w14="http://schemas.microsoft.com/office/word/2010/wordml" xmlns:w15="http://schemas.microsoft.com/office/word/2012/wordml" xmlns:w16cex="http://schemas.microsoft.com/office/word/2018/wordml/cex" xmlns:w16cid="http://schemas.microsoft.com/office/word/2016/wordml/cid" xmlns:w16="http://schemas.microsoft.com/office/word/2018/wordml" xmlns:w16se="http://schemas.microsoft.com/office/word/2015/wordml/symex" xmlns:wpg="http://schemas.microsoft.com/office/word/2010/wordprocessingGroup" xmlns:wpi="http://schemas.microsoft.com/office/word/2010/wordprocessingInk" xmlns:wne="http://schemas.microsoft.com/office/word/2006/wordml" xmlns:wps="http://schemas.microsoft.com/office/word/2010/wordprocessingShape" mc:Ignorable="w14 w15 w16se w16cid w16 w16cex wp14">
   <w:sdt>
     <w:sdtPr>
       <w:id w:val="-517623792"/>
@@ -3877,7 +3955,7 @@
 </file>
 
 <file path=word/footer2.xml><?xml version="1.0" encoding="utf-8"?>
-<w:ftr xmlns:wpc="http://schemas.microsoft.com/office/word/2010/wordprocessingCanvas" xmlns:cx="http://schemas.microsoft.com/office/drawing/2014/chartex" xmlns:cx1="http://schemas.microsoft.com/office/drawing/2015/9/8/chartex" xmlns:cx2="http://schemas.microsoft.com/office/drawing/2015/10/21/chartex" xmlns:cx3="http://schemas.microsoft.com/office/drawing/2016/5/9/chartex" xmlns:cx4="http://schemas.microsoft.com/office/drawing/2016/5/10/chartex" xmlns:cx5="http://schemas.microsoft.com/office/drawing/2016/5/11/chartex" xmlns:cx6="http://schemas.microsoft.com/office/drawing/2016/5/12/chartex" xmlns:cx7="http://schemas.microsoft.com/office/drawing/2016/5/13/chartex" xmlns:cx8="http://schemas.microsoft.com/office/drawing/2016/5/14/chartex" xmlns:mc="http://schemas.openxmlformats.org/markup-compatibility/2006" xmlns:aink="http://schemas.microsoft.com/office/drawing/2016/ink" xmlns:am3d="http://schemas.microsoft.com/office/drawing/2017/model3d" xmlns:o="urn:schemas-microsoft-com:office:office" xmlns:oel="http://schemas.microsoft.com/office/2019/extlst" xmlns:r="http://schemas.openxmlformats.org/officeDocument/2006/relationships" xmlns:m="http://schemas.openxmlformats.org/officeDocument/2006/math" xmlns:v="urn:schemas-microsoft-com:vml" xmlns:wp14="http://schemas.microsoft.com/office/word/2010/wordprocessingDrawing" xmlns:wp="http://schemas.openxmlformats.org/drawingml/2006/wordprocessingDrawing" xmlns:w10="urn:schemas-microsoft-com:office:word" xmlns:w="http://schemas.openxmlformats.org/wordprocessingml/2006/main" xmlns:w14="http://schemas.microsoft.com/office/word/2010/wordml" xmlns:w15="http://schemas.microsoft.com/office/word/2012/wordml" xmlns:w16cex="http://schemas.microsoft.com/office/word/2018/wordml/cex" xmlns:w16cid="http://schemas.microsoft.com/office/word/2016/wordml/cid" xmlns:w16="http://schemas.microsoft.com/office/word/2018/wordml" xmlns:w16du="http://schemas.microsoft.com/office/word/2023/wordml/word16du" xmlns:w16sdtdh="http://schemas.microsoft.com/office/word/2020/wordml/sdtdatahash" xmlns:w16sdtfl="http://schemas.microsoft.com/office/word/2024/wordml/sdtformatlock" xmlns:w16se="http://schemas.microsoft.com/office/word/2015/wordml/symex" xmlns:wpg="http://schemas.microsoft.com/office/word/2010/wordprocessingGroup" xmlns:wpi="http://schemas.microsoft.com/office/word/2010/wordprocessingInk" xmlns:wne="http://schemas.microsoft.com/office/word/2006/wordml" xmlns:wps="http://schemas.microsoft.com/office/word/2010/wordprocessingShape" mc:Ignorable="w14 w15 w16se w16cid w16 w16cex w16sdtdh w16sdtfl w16du wp14">
+<w:ftr xmlns:wpc="http://schemas.microsoft.com/office/word/2010/wordprocessingCanvas" xmlns:cx="http://schemas.microsoft.com/office/drawing/2014/chartex" xmlns:cx1="http://schemas.microsoft.com/office/drawing/2015/9/8/chartex" xmlns:cx2="http://schemas.microsoft.com/office/drawing/2015/10/21/chartex" xmlns:cx3="http://schemas.microsoft.com/office/drawing/2016/5/9/chartex" xmlns:cx4="http://schemas.microsoft.com/office/drawing/2016/5/10/chartex" xmlns:cx5="http://schemas.microsoft.com/office/drawing/2016/5/11/chartex" xmlns:cx6="http://schemas.microsoft.com/office/drawing/2016/5/12/chartex" xmlns:cx7="http://schemas.microsoft.com/office/drawing/2016/5/13/chartex" xmlns:cx8="http://schemas.microsoft.com/office/drawing/2016/5/14/chartex" xmlns:mc="http://schemas.openxmlformats.org/markup-compatibility/2006" xmlns:aink="http://schemas.microsoft.com/office/drawing/2016/ink" xmlns:am3d="http://schemas.microsoft.com/office/drawing/2017/model3d" xmlns:o="urn:schemas-microsoft-com:office:office" xmlns:r="http://schemas.openxmlformats.org/officeDocument/2006/relationships" xmlns:m="http://schemas.openxmlformats.org/officeDocument/2006/math" xmlns:v="urn:schemas-microsoft-com:vml" xmlns:wp14="http://schemas.microsoft.com/office/word/2010/wordprocessingDrawing" xmlns:wp="http://schemas.openxmlformats.org/drawingml/2006/wordprocessingDrawing" xmlns:w10="urn:schemas-microsoft-com:office:word" xmlns:w="http://schemas.openxmlformats.org/wordprocessingml/2006/main" xmlns:w14="http://schemas.microsoft.com/office/word/2010/wordml" xmlns:w15="http://schemas.microsoft.com/office/word/2012/wordml" xmlns:w16cex="http://schemas.microsoft.com/office/word/2018/wordml/cex" xmlns:w16cid="http://schemas.microsoft.com/office/word/2016/wordml/cid" xmlns:w16="http://schemas.microsoft.com/office/word/2018/wordml" xmlns:w16se="http://schemas.microsoft.com/office/word/2015/wordml/symex" xmlns:wpg="http://schemas.microsoft.com/office/word/2010/wordprocessingGroup" xmlns:wpi="http://schemas.microsoft.com/office/word/2010/wordprocessingInk" xmlns:wne="http://schemas.microsoft.com/office/word/2006/wordml" xmlns:wps="http://schemas.microsoft.com/office/word/2010/wordprocessingShape" mc:Ignorable="w14 w15 w16se w16cid w16 w16cex wp14">
   <w:sdt>
     <w:sdtPr>
       <w:id w:val="-234937495"/>
@@ -3926,7 +4004,7 @@
 </file>
 
 <file path=word/footnotes.xml><?xml version="1.0" encoding="utf-8"?>
-<w:footnotes xmlns:wpc="http://schemas.microsoft.com/office/word/2010/wordprocessingCanvas" xmlns:cx="http://schemas.microsoft.com/office/drawing/2014/chartex" xmlns:cx1="http://schemas.microsoft.com/office/drawing/2015/9/8/chartex" xmlns:cx2="http://schemas.microsoft.com/office/drawing/2015/10/21/chartex" xmlns:cx3="http://schemas.microsoft.com/office/drawing/2016/5/9/chartex" xmlns:cx4="http://schemas.microsoft.com/office/drawing/2016/5/10/chartex" xmlns:cx5="http://schemas.microsoft.com/office/drawing/2016/5/11/chartex" xmlns:cx6="http://schemas.microsoft.com/office/drawing/2016/5/12/chartex" xmlns:cx7="http://schemas.microsoft.com/office/drawing/2016/5/13/chartex" xmlns:cx8="http://schemas.microsoft.com/office/drawing/2016/5/14/chartex" xmlns:mc="http://schemas.openxmlformats.org/markup-compatibility/2006" xmlns:aink="http://schemas.microsoft.com/office/drawing/2016/ink" xmlns:am3d="http://schemas.microsoft.com/office/drawing/2017/model3d" xmlns:o="urn:schemas-microsoft-com:office:office" xmlns:oel="http://schemas.microsoft.com/office/2019/extlst" xmlns:r="http://schemas.openxmlformats.org/officeDocument/2006/relationships" xmlns:m="http://schemas.openxmlformats.org/officeDocument/2006/math" xmlns:v="urn:schemas-microsoft-com:vml" xmlns:wp14="http://schemas.microsoft.com/office/word/2010/wordprocessingDrawing" xmlns:wp="http://schemas.openxmlformats.org/drawingml/2006/wordprocessingDrawing" xmlns:w10="urn:schemas-microsoft-com:office:word" xmlns:w="http://schemas.openxmlformats.org/wordprocessingml/2006/main" xmlns:w14="http://schemas.microsoft.com/office/word/2010/wordml" xmlns:w15="http://schemas.microsoft.com/office/word/2012/wordml" xmlns:w16cex="http://schemas.microsoft.com/office/word/2018/wordml/cex" xmlns:w16cid="http://schemas.microsoft.com/office/word/2016/wordml/cid" xmlns:w16="http://schemas.microsoft.com/office/word/2018/wordml" xmlns:w16du="http://schemas.microsoft.com/office/word/2023/wordml/word16du" xmlns:w16sdtdh="http://schemas.microsoft.com/office/word/2020/wordml/sdtdatahash" xmlns:w16sdtfl="http://schemas.microsoft.com/office/word/2024/wordml/sdtformatlock" xmlns:w16se="http://schemas.microsoft.com/office/word/2015/wordml/symex" xmlns:wpg="http://schemas.microsoft.com/office/word/2010/wordprocessingGroup" xmlns:wpi="http://schemas.microsoft.com/office/word/2010/wordprocessingInk" xmlns:wne="http://schemas.microsoft.com/office/word/2006/wordml" xmlns:wps="http://schemas.microsoft.com/office/word/2010/wordprocessingShape" mc:Ignorable="w14 w15 w16se w16cid w16 w16cex w16sdtdh w16sdtfl w16du wp14">
+<w:footnotes xmlns:wpc="http://schemas.microsoft.com/office/word/2010/wordprocessingCanvas" xmlns:cx="http://schemas.microsoft.com/office/drawing/2014/chartex" xmlns:cx1="http://schemas.microsoft.com/office/drawing/2015/9/8/chartex" xmlns:cx2="http://schemas.microsoft.com/office/drawing/2015/10/21/chartex" xmlns:cx3="http://schemas.microsoft.com/office/drawing/2016/5/9/chartex" xmlns:cx4="http://schemas.microsoft.com/office/drawing/2016/5/10/chartex" xmlns:cx5="http://schemas.microsoft.com/office/drawing/2016/5/11/chartex" xmlns:cx6="http://schemas.microsoft.com/office/drawing/2016/5/12/chartex" xmlns:cx7="http://schemas.microsoft.com/office/drawing/2016/5/13/chartex" xmlns:cx8="http://schemas.microsoft.com/office/drawing/2016/5/14/chartex" xmlns:mc="http://schemas.openxmlformats.org/markup-compatibility/2006" xmlns:aink="http://schemas.microsoft.com/office/drawing/2016/ink" xmlns:am3d="http://schemas.microsoft.com/office/drawing/2017/model3d" xmlns:o="urn:schemas-microsoft-com:office:office" xmlns:r="http://schemas.openxmlformats.org/officeDocument/2006/relationships" xmlns:m="http://schemas.openxmlformats.org/officeDocument/2006/math" xmlns:v="urn:schemas-microsoft-com:vml" xmlns:wp14="http://schemas.microsoft.com/office/word/2010/wordprocessingDrawing" xmlns:wp="http://schemas.openxmlformats.org/drawingml/2006/wordprocessingDrawing" xmlns:w10="urn:schemas-microsoft-com:office:word" xmlns:w="http://schemas.openxmlformats.org/wordprocessingml/2006/main" xmlns:w14="http://schemas.microsoft.com/office/word/2010/wordml" xmlns:w15="http://schemas.microsoft.com/office/word/2012/wordml" xmlns:w16cex="http://schemas.microsoft.com/office/word/2018/wordml/cex" xmlns:w16cid="http://schemas.microsoft.com/office/word/2016/wordml/cid" xmlns:w16="http://schemas.microsoft.com/office/word/2018/wordml" xmlns:w16se="http://schemas.microsoft.com/office/word/2015/wordml/symex" xmlns:wpg="http://schemas.microsoft.com/office/word/2010/wordprocessingGroup" xmlns:wpi="http://schemas.microsoft.com/office/word/2010/wordprocessingInk" xmlns:wne="http://schemas.microsoft.com/office/word/2006/wordml" xmlns:wps="http://schemas.microsoft.com/office/word/2010/wordprocessingShape" mc:Ignorable="w14 w15 w16se w16cid w16 w16cex wp14">
   <w:footnote w:type="separator" w:id="-1">
     <w:p>
       <w:pPr>
@@ -3953,7 +4031,7 @@
 </file>
 
 <file path=word/numbering.xml><?xml version="1.0" encoding="utf-8"?>
-<w:numbering xmlns:wpc="http://schemas.microsoft.com/office/word/2010/wordprocessingCanvas" xmlns:cx="http://schemas.microsoft.com/office/drawing/2014/chartex" xmlns:cx1="http://schemas.microsoft.com/office/drawing/2015/9/8/chartex" xmlns:cx2="http://schemas.microsoft.com/office/drawing/2015/10/21/chartex" xmlns:cx3="http://schemas.microsoft.com/office/drawing/2016/5/9/chartex" xmlns:cx4="http://schemas.microsoft.com/office/drawing/2016/5/10/chartex" xmlns:cx5="http://schemas.microsoft.com/office/drawing/2016/5/11/chartex" xmlns:cx6="http://schemas.microsoft.com/office/drawing/2016/5/12/chartex" xmlns:cx7="http://schemas.microsoft.com/office/drawing/2016/5/13/chartex" xmlns:cx8="http://schemas.microsoft.com/office/drawing/2016/5/14/chartex" xmlns:mc="http://schemas.openxmlformats.org/markup-compatibility/2006" xmlns:aink="http://schemas.microsoft.com/office/drawing/2016/ink" xmlns:am3d="http://schemas.microsoft.com/office/drawing/2017/model3d" xmlns:o="urn:schemas-microsoft-com:office:office" xmlns:oel="http://schemas.microsoft.com/office/2019/extlst" xmlns:r="http://schemas.openxmlformats.org/officeDocument/2006/relationships" xmlns:m="http://schemas.openxmlformats.org/officeDocument/2006/math" xmlns:v="urn:schemas-microsoft-com:vml" xmlns:wp14="http://schemas.microsoft.com/office/word/2010/wordprocessingDrawing" xmlns:wp="http://schemas.openxmlformats.org/drawingml/2006/wordprocessingDrawing" xmlns:w10="urn:schemas-microsoft-com:office:word" xmlns:w="http://schemas.openxmlformats.org/wordprocessingml/2006/main" xmlns:w14="http://schemas.microsoft.com/office/word/2010/wordml" xmlns:w15="http://schemas.microsoft.com/office/word/2012/wordml" xmlns:w16cex="http://schemas.microsoft.com/office/word/2018/wordml/cex" xmlns:w16cid="http://schemas.microsoft.com/office/word/2016/wordml/cid" xmlns:w16="http://schemas.microsoft.com/office/word/2018/wordml" xmlns:w16du="http://schemas.microsoft.com/office/word/2023/wordml/word16du" xmlns:w16sdtdh="http://schemas.microsoft.com/office/word/2020/wordml/sdtdatahash" xmlns:w16sdtfl="http://schemas.microsoft.com/office/word/2024/wordml/sdtformatlock" xmlns:w16se="http://schemas.microsoft.com/office/word/2015/wordml/symex" xmlns:wpg="http://schemas.microsoft.com/office/word/2010/wordprocessingGroup" xmlns:wpi="http://schemas.microsoft.com/office/word/2010/wordprocessingInk" xmlns:wne="http://schemas.microsoft.com/office/word/2006/wordml" xmlns:wps="http://schemas.microsoft.com/office/word/2010/wordprocessingShape" mc:Ignorable="w14 w15 w16se w16cid w16 w16cex w16sdtdh w16sdtfl w16du wp14">
+<w:numbering xmlns:wpc="http://schemas.microsoft.com/office/word/2010/wordprocessingCanvas" xmlns:cx="http://schemas.microsoft.com/office/drawing/2014/chartex" xmlns:cx1="http://schemas.microsoft.com/office/drawing/2015/9/8/chartex" xmlns:cx2="http://schemas.microsoft.com/office/drawing/2015/10/21/chartex" xmlns:cx3="http://schemas.microsoft.com/office/drawing/2016/5/9/chartex" xmlns:cx4="http://schemas.microsoft.com/office/drawing/2016/5/10/chartex" xmlns:cx5="http://schemas.microsoft.com/office/drawing/2016/5/11/chartex" xmlns:cx6="http://schemas.microsoft.com/office/drawing/2016/5/12/chartex" xmlns:cx7="http://schemas.microsoft.com/office/drawing/2016/5/13/chartex" xmlns:cx8="http://schemas.microsoft.com/office/drawing/2016/5/14/chartex" xmlns:mc="http://schemas.openxmlformats.org/markup-compatibility/2006" xmlns:aink="http://schemas.microsoft.com/office/drawing/2016/ink" xmlns:am3d="http://schemas.microsoft.com/office/drawing/2017/model3d" xmlns:o="urn:schemas-microsoft-com:office:office" xmlns:r="http://schemas.openxmlformats.org/officeDocument/2006/relationships" xmlns:m="http://schemas.openxmlformats.org/officeDocument/2006/math" xmlns:v="urn:schemas-microsoft-com:vml" xmlns:wp14="http://schemas.microsoft.com/office/word/2010/wordprocessingDrawing" xmlns:wp="http://schemas.openxmlformats.org/drawingml/2006/wordprocessingDrawing" xmlns:w10="urn:schemas-microsoft-com:office:word" xmlns:w="http://schemas.openxmlformats.org/wordprocessingml/2006/main" xmlns:w14="http://schemas.microsoft.com/office/word/2010/wordml" xmlns:w15="http://schemas.microsoft.com/office/word/2012/wordml" xmlns:w16cex="http://schemas.microsoft.com/office/word/2018/wordml/cex" xmlns:w16cid="http://schemas.microsoft.com/office/word/2016/wordml/cid" xmlns:w16="http://schemas.microsoft.com/office/word/2018/wordml" xmlns:w16se="http://schemas.microsoft.com/office/word/2015/wordml/symex" xmlns:wpg="http://schemas.microsoft.com/office/word/2010/wordprocessingGroup" xmlns:wpi="http://schemas.microsoft.com/office/word/2010/wordprocessingInk" xmlns:wne="http://schemas.microsoft.com/office/word/2006/wordml" xmlns:wps="http://schemas.microsoft.com/office/word/2010/wordprocessingShape" mc:Ignorable="w14 w15 w16se w16cid w16 w16cex wp14">
   <w:abstractNum w:abstractNumId="0" w15:restartNumberingAfterBreak="0">
     <w:nsid w:val="01344BC1"/>
     <w:multiLevelType w:val="hybridMultilevel"/>
@@ -6953,106 +7031,106 @@
       </w:pPr>
     </w:lvl>
   </w:abstractNum>
-  <w:num w:numId="1" w16cid:durableId="1682511691">
+  <w:num w:numId="1">
     <w:abstractNumId w:val="31"/>
   </w:num>
-  <w:num w:numId="2" w16cid:durableId="2032609344">
+  <w:num w:numId="2">
     <w:abstractNumId w:val="25"/>
   </w:num>
-  <w:num w:numId="3" w16cid:durableId="1936940783">
+  <w:num w:numId="3">
     <w:abstractNumId w:val="10"/>
   </w:num>
-  <w:num w:numId="4" w16cid:durableId="769356308">
+  <w:num w:numId="4">
     <w:abstractNumId w:val="9"/>
   </w:num>
-  <w:num w:numId="5" w16cid:durableId="1487093862">
+  <w:num w:numId="5">
     <w:abstractNumId w:val="22"/>
   </w:num>
-  <w:num w:numId="6" w16cid:durableId="1572883370">
+  <w:num w:numId="6">
     <w:abstractNumId w:val="2"/>
   </w:num>
-  <w:num w:numId="7" w16cid:durableId="544758890">
+  <w:num w:numId="7">
     <w:abstractNumId w:val="32"/>
   </w:num>
-  <w:num w:numId="8" w16cid:durableId="1285111919">
+  <w:num w:numId="8">
     <w:abstractNumId w:val="7"/>
   </w:num>
-  <w:num w:numId="9" w16cid:durableId="1384863598">
+  <w:num w:numId="9">
     <w:abstractNumId w:val="0"/>
   </w:num>
-  <w:num w:numId="10" w16cid:durableId="1832335355">
+  <w:num w:numId="10">
     <w:abstractNumId w:val="1"/>
   </w:num>
-  <w:num w:numId="11" w16cid:durableId="1958484675">
+  <w:num w:numId="11">
     <w:abstractNumId w:val="14"/>
   </w:num>
-  <w:num w:numId="12" w16cid:durableId="1886672944">
+  <w:num w:numId="12">
     <w:abstractNumId w:val="21"/>
   </w:num>
-  <w:num w:numId="13" w16cid:durableId="1911377699">
+  <w:num w:numId="13">
     <w:abstractNumId w:val="17"/>
   </w:num>
-  <w:num w:numId="14" w16cid:durableId="750128335">
+  <w:num w:numId="14">
     <w:abstractNumId w:val="30"/>
   </w:num>
-  <w:num w:numId="15" w16cid:durableId="2138715381">
+  <w:num w:numId="15">
     <w:abstractNumId w:val="28"/>
   </w:num>
-  <w:num w:numId="16" w16cid:durableId="2088845672">
+  <w:num w:numId="16">
     <w:abstractNumId w:val="4"/>
   </w:num>
-  <w:num w:numId="17" w16cid:durableId="543641009">
+  <w:num w:numId="17">
     <w:abstractNumId w:val="3"/>
   </w:num>
-  <w:num w:numId="18" w16cid:durableId="523785565">
+  <w:num w:numId="18">
     <w:abstractNumId w:val="26"/>
   </w:num>
-  <w:num w:numId="19" w16cid:durableId="444008506">
+  <w:num w:numId="19">
     <w:abstractNumId w:val="19"/>
   </w:num>
-  <w:num w:numId="20" w16cid:durableId="166485882">
+  <w:num w:numId="20">
     <w:abstractNumId w:val="15"/>
   </w:num>
-  <w:num w:numId="21" w16cid:durableId="1039360351">
+  <w:num w:numId="21">
     <w:abstractNumId w:val="5"/>
   </w:num>
-  <w:num w:numId="22" w16cid:durableId="792020348">
+  <w:num w:numId="22">
     <w:abstractNumId w:val="6"/>
   </w:num>
-  <w:num w:numId="23" w16cid:durableId="704452901">
+  <w:num w:numId="23">
     <w:abstractNumId w:val="20"/>
   </w:num>
-  <w:num w:numId="24" w16cid:durableId="357699425">
+  <w:num w:numId="24">
     <w:abstractNumId w:val="13"/>
   </w:num>
-  <w:num w:numId="25" w16cid:durableId="1212307053">
+  <w:num w:numId="25">
     <w:abstractNumId w:val="18"/>
   </w:num>
-  <w:num w:numId="26" w16cid:durableId="1648511375">
+  <w:num w:numId="26">
     <w:abstractNumId w:val="11"/>
   </w:num>
-  <w:num w:numId="27" w16cid:durableId="1647313908">
+  <w:num w:numId="27">
     <w:abstractNumId w:val="27"/>
   </w:num>
-  <w:num w:numId="28" w16cid:durableId="2101682248">
+  <w:num w:numId="28">
     <w:abstractNumId w:val="23"/>
   </w:num>
-  <w:num w:numId="29" w16cid:durableId="1631937274">
+  <w:num w:numId="29">
     <w:abstractNumId w:val="16"/>
   </w:num>
-  <w:num w:numId="30" w16cid:durableId="278879858">
+  <w:num w:numId="30">
     <w:abstractNumId w:val="24"/>
   </w:num>
-  <w:num w:numId="31" w16cid:durableId="1955094542">
+  <w:num w:numId="31">
     <w:abstractNumId w:val="33"/>
   </w:num>
-  <w:num w:numId="32" w16cid:durableId="1239369044">
+  <w:num w:numId="32">
     <w:abstractNumId w:val="12"/>
   </w:num>
-  <w:num w:numId="33" w16cid:durableId="181363948">
+  <w:num w:numId="33">
     <w:abstractNumId w:val="8"/>
   </w:num>
-  <w:num w:numId="34" w16cid:durableId="623733193">
+  <w:num w:numId="34">
     <w:abstractNumId w:val="29"/>
   </w:num>
   <w:numIdMacAtCleanup w:val="2"/>
@@ -7060,7 +7138,7 @@
 </file>
 
 <file path=word/styles.xml><?xml version="1.0" encoding="utf-8"?>
-<w:styles xmlns:mc="http://schemas.openxmlformats.org/markup-compatibility/2006" xmlns:r="http://schemas.openxmlformats.org/officeDocument/2006/relationships" xmlns:w="http://schemas.openxmlformats.org/wordprocessingml/2006/main" xmlns:w14="http://schemas.microsoft.com/office/word/2010/wordml" xmlns:w15="http://schemas.microsoft.com/office/word/2012/wordml" xmlns:w16cex="http://schemas.microsoft.com/office/word/2018/wordml/cex" xmlns:w16cid="http://schemas.microsoft.com/office/word/2016/wordml/cid" xmlns:w16="http://schemas.microsoft.com/office/word/2018/wordml" xmlns:w16du="http://schemas.microsoft.com/office/word/2023/wordml/word16du" xmlns:w16sdtdh="http://schemas.microsoft.com/office/word/2020/wordml/sdtdatahash" xmlns:w16sdtfl="http://schemas.microsoft.com/office/word/2024/wordml/sdtformatlock" xmlns:w16se="http://schemas.microsoft.com/office/word/2015/wordml/symex" mc:Ignorable="w14 w15 w16se w16cid w16 w16cex w16sdtdh w16sdtfl w16du">
+<w:styles xmlns:mc="http://schemas.openxmlformats.org/markup-compatibility/2006" xmlns:r="http://schemas.openxmlformats.org/officeDocument/2006/relationships" xmlns:w="http://schemas.openxmlformats.org/wordprocessingml/2006/main" xmlns:w14="http://schemas.microsoft.com/office/word/2010/wordml" xmlns:w15="http://schemas.microsoft.com/office/word/2012/wordml" xmlns:w16cex="http://schemas.microsoft.com/office/word/2018/wordml/cex" xmlns:w16cid="http://schemas.microsoft.com/office/word/2016/wordml/cid" xmlns:w16="http://schemas.microsoft.com/office/word/2018/wordml" xmlns:w16se="http://schemas.microsoft.com/office/word/2015/wordml/symex" mc:Ignorable="w14 w15 w16se w16cid w16 w16cex">
   <w:docDefaults>
     <w:rPrDefault>
       <w:rPr>
@@ -7894,10 +7972,9 @@
     <w:basedOn w:val="Normal"/>
     <w:link w:val="TextChar"/>
     <w:qFormat/>
-    <w:rsid w:val="001D32B5"/>
+    <w:rsid w:val="00536E47"/>
     <w:pPr>
       <w:spacing w:after="120"/>
-      <w:ind w:left="567"/>
     </w:pPr>
     <w:rPr>
       <w:lang w:val="en-US"/>
@@ -7922,7 +7999,7 @@
     <w:name w:val="Text Char"/>
     <w:basedOn w:val="DefaultParagraphFont"/>
     <w:link w:val="Text"/>
-    <w:rsid w:val="001D32B5"/>
+    <w:rsid w:val="00536E47"/>
     <w:rPr>
       <w:rFonts w:ascii="Times New Roman" w:eastAsia="Times New Roman" w:hAnsi="Times New Roman" w:cs="Times New Roman"/>
       <w:sz w:val="24"/>

</xml_diff>

<commit_message>
update v4.2.5 'bug fixed, penomoran gambar pada bab 2 format-2.docx'
</commit_message>
<xml_diff>
--- a/kuliah/DocumentGenerator_Laporan_Praktikum/src/templates/format-2.docx
+++ b/kuliah/DocumentGenerator_Laporan_Praktikum/src/templates/format-2.docx
@@ -1,6 +1,6 @@
 
 <file path=word/document.xml><?xml version="1.0" encoding="utf-8"?>
-<w:document xmlns:wpc="http://schemas.microsoft.com/office/word/2010/wordprocessingCanvas" xmlns:cx="http://schemas.microsoft.com/office/drawing/2014/chartex" xmlns:cx1="http://schemas.microsoft.com/office/drawing/2015/9/8/chartex" xmlns:cx2="http://schemas.microsoft.com/office/drawing/2015/10/21/chartex" xmlns:cx3="http://schemas.microsoft.com/office/drawing/2016/5/9/chartex" xmlns:cx4="http://schemas.microsoft.com/office/drawing/2016/5/10/chartex" xmlns:cx5="http://schemas.microsoft.com/office/drawing/2016/5/11/chartex" xmlns:cx6="http://schemas.microsoft.com/office/drawing/2016/5/12/chartex" xmlns:cx7="http://schemas.microsoft.com/office/drawing/2016/5/13/chartex" xmlns:cx8="http://schemas.microsoft.com/office/drawing/2016/5/14/chartex" xmlns:mc="http://schemas.openxmlformats.org/markup-compatibility/2006" xmlns:aink="http://schemas.microsoft.com/office/drawing/2016/ink" xmlns:am3d="http://schemas.microsoft.com/office/drawing/2017/model3d" xmlns:o="urn:schemas-microsoft-com:office:office" xmlns:oel="http://schemas.microsoft.com/office/2019/extlst" xmlns:r="http://schemas.openxmlformats.org/officeDocument/2006/relationships" xmlns:m="http://schemas.openxmlformats.org/officeDocument/2006/math" xmlns:v="urn:schemas-microsoft-com:vml" xmlns:wp14="http://schemas.microsoft.com/office/word/2010/wordprocessingDrawing" xmlns:wp="http://schemas.openxmlformats.org/drawingml/2006/wordprocessingDrawing" xmlns:w10="urn:schemas-microsoft-com:office:word" xmlns:w="http://schemas.openxmlformats.org/wordprocessingml/2006/main" xmlns:w14="http://schemas.microsoft.com/office/word/2010/wordml" xmlns:w15="http://schemas.microsoft.com/office/word/2012/wordml" xmlns:w16cex="http://schemas.microsoft.com/office/word/2018/wordml/cex" xmlns:w16cid="http://schemas.microsoft.com/office/word/2016/wordml/cid" xmlns:w16="http://schemas.microsoft.com/office/word/2018/wordml" xmlns:w16du="http://schemas.microsoft.com/office/word/2023/wordml/word16du" xmlns:w16sdtdh="http://schemas.microsoft.com/office/word/2020/wordml/sdtdatahash" xmlns:w16sdtfl="http://schemas.microsoft.com/office/word/2024/wordml/sdtformatlock" xmlns:w16se="http://schemas.microsoft.com/office/word/2015/wordml/symex" xmlns:wpg="http://schemas.microsoft.com/office/word/2010/wordprocessingGroup" xmlns:wpi="http://schemas.microsoft.com/office/word/2010/wordprocessingInk" xmlns:wne="http://schemas.microsoft.com/office/word/2006/wordml" xmlns:wps="http://schemas.microsoft.com/office/word/2010/wordprocessingShape" mc:Ignorable="w14 w15 w16se w16cid w16 w16cex w16sdtdh w16sdtfl w16du wp14">
+<w:document xmlns:wpc="http://schemas.microsoft.com/office/word/2010/wordprocessingCanvas" xmlns:cx="http://schemas.microsoft.com/office/drawing/2014/chartex" xmlns:cx1="http://schemas.microsoft.com/office/drawing/2015/9/8/chartex" xmlns:cx2="http://schemas.microsoft.com/office/drawing/2015/10/21/chartex" xmlns:cx3="http://schemas.microsoft.com/office/drawing/2016/5/9/chartex" xmlns:cx4="http://schemas.microsoft.com/office/drawing/2016/5/10/chartex" xmlns:cx5="http://schemas.microsoft.com/office/drawing/2016/5/11/chartex" xmlns:cx6="http://schemas.microsoft.com/office/drawing/2016/5/12/chartex" xmlns:cx7="http://schemas.microsoft.com/office/drawing/2016/5/13/chartex" xmlns:cx8="http://schemas.microsoft.com/office/drawing/2016/5/14/chartex" xmlns:mc="http://schemas.openxmlformats.org/markup-compatibility/2006" xmlns:aink="http://schemas.microsoft.com/office/drawing/2016/ink" xmlns:am3d="http://schemas.microsoft.com/office/drawing/2017/model3d" xmlns:o="urn:schemas-microsoft-com:office:office" xmlns:r="http://schemas.openxmlformats.org/officeDocument/2006/relationships" xmlns:m="http://schemas.openxmlformats.org/officeDocument/2006/math" xmlns:v="urn:schemas-microsoft-com:vml" xmlns:wp14="http://schemas.microsoft.com/office/word/2010/wordprocessingDrawing" xmlns:wp="http://schemas.openxmlformats.org/drawingml/2006/wordprocessingDrawing" xmlns:w10="urn:schemas-microsoft-com:office:word" xmlns:w="http://schemas.openxmlformats.org/wordprocessingml/2006/main" xmlns:w14="http://schemas.microsoft.com/office/word/2010/wordml" xmlns:w15="http://schemas.microsoft.com/office/word/2012/wordml" xmlns:w16cex="http://schemas.microsoft.com/office/word/2018/wordml/cex" xmlns:w16cid="http://schemas.microsoft.com/office/word/2016/wordml/cid" xmlns:w16="http://schemas.microsoft.com/office/word/2018/wordml" xmlns:w16se="http://schemas.microsoft.com/office/word/2015/wordml/symex" xmlns:wpg="http://schemas.microsoft.com/office/word/2010/wordprocessingGroup" xmlns:wpi="http://schemas.microsoft.com/office/word/2010/wordprocessingInk" xmlns:wne="http://schemas.microsoft.com/office/word/2006/wordml" xmlns:wps="http://schemas.microsoft.com/office/word/2010/wordprocessingShape" mc:Ignorable="w14 w15 w16se w16cid w16 w16cex wp14">
   <w:body>
     <w:p>
       <w:pPr>
@@ -2964,7 +2964,6 @@
       </w:pPr>
       <w:bookmarkStart w:id="0" w:name="_Toc197688582"/>
       <w:r>
-        <w:lastRenderedPageBreak/>
         <w:t>DAFTAR GAMBAR</w:t>
       </w:r>
       <w:bookmarkEnd w:id="0"/>
@@ -3048,7 +3047,6 @@
       </w:pPr>
       <w:bookmarkStart w:id="1" w:name="_Toc197688583"/>
       <w:r>
-        <w:lastRenderedPageBreak/>
         <w:t>HASIL PRAKTIKUM</w:t>
       </w:r>
       <w:bookmarkEnd w:id="1"/>
@@ -3453,7 +3451,6 @@
         <w:rPr>
           <w:lang w:val="en-US"/>
         </w:rPr>
-        <w:lastRenderedPageBreak/>
         <w:t>{{ item.penjelasan_singkat }}</w:t>
       </w:r>
     </w:p>
@@ -3727,7 +3724,7 @@
     </w:p>
     <w:p>
       <w:pPr>
-        <w:ind w:left="1191"/>
+        <w:ind w:left="1077"/>
         <w:rPr>
           <w:lang w:val="en-US"/>
         </w:rPr>
@@ -3760,9 +3757,17 @@
     </w:p>
     <w:p>
       <w:pPr>
-        <w:ind w:left="1191"/>
-      </w:pPr>
-      <w:r>
+        <w:ind w:left="1021"/>
+        <w:rPr>
+          <w:sz w:val="6"/>
+          <w:szCs w:val="6"/>
+        </w:rPr>
+      </w:pPr>
+      <w:r>
+        <w:rPr>
+          <w:sz w:val="6"/>
+          <w:szCs w:val="6"/>
+        </w:rPr>
         <w:t>{% endfor %}</w:t>
       </w:r>
     </w:p>
@@ -3884,7 +3889,7 @@
 </file>
 
 <file path=word/endnotes.xml><?xml version="1.0" encoding="utf-8"?>
-<w:endnotes xmlns:wpc="http://schemas.microsoft.com/office/word/2010/wordprocessingCanvas" xmlns:cx="http://schemas.microsoft.com/office/drawing/2014/chartex" xmlns:cx1="http://schemas.microsoft.com/office/drawing/2015/9/8/chartex" xmlns:cx2="http://schemas.microsoft.com/office/drawing/2015/10/21/chartex" xmlns:cx3="http://schemas.microsoft.com/office/drawing/2016/5/9/chartex" xmlns:cx4="http://schemas.microsoft.com/office/drawing/2016/5/10/chartex" xmlns:cx5="http://schemas.microsoft.com/office/drawing/2016/5/11/chartex" xmlns:cx6="http://schemas.microsoft.com/office/drawing/2016/5/12/chartex" xmlns:cx7="http://schemas.microsoft.com/office/drawing/2016/5/13/chartex" xmlns:cx8="http://schemas.microsoft.com/office/drawing/2016/5/14/chartex" xmlns:mc="http://schemas.openxmlformats.org/markup-compatibility/2006" xmlns:aink="http://schemas.microsoft.com/office/drawing/2016/ink" xmlns:am3d="http://schemas.microsoft.com/office/drawing/2017/model3d" xmlns:o="urn:schemas-microsoft-com:office:office" xmlns:oel="http://schemas.microsoft.com/office/2019/extlst" xmlns:r="http://schemas.openxmlformats.org/officeDocument/2006/relationships" xmlns:m="http://schemas.openxmlformats.org/officeDocument/2006/math" xmlns:v="urn:schemas-microsoft-com:vml" xmlns:wp14="http://schemas.microsoft.com/office/word/2010/wordprocessingDrawing" xmlns:wp="http://schemas.openxmlformats.org/drawingml/2006/wordprocessingDrawing" xmlns:w10="urn:schemas-microsoft-com:office:word" xmlns:w="http://schemas.openxmlformats.org/wordprocessingml/2006/main" xmlns:w14="http://schemas.microsoft.com/office/word/2010/wordml" xmlns:w15="http://schemas.microsoft.com/office/word/2012/wordml" xmlns:w16cex="http://schemas.microsoft.com/office/word/2018/wordml/cex" xmlns:w16cid="http://schemas.microsoft.com/office/word/2016/wordml/cid" xmlns:w16="http://schemas.microsoft.com/office/word/2018/wordml" xmlns:w16du="http://schemas.microsoft.com/office/word/2023/wordml/word16du" xmlns:w16sdtdh="http://schemas.microsoft.com/office/word/2020/wordml/sdtdatahash" xmlns:w16sdtfl="http://schemas.microsoft.com/office/word/2024/wordml/sdtformatlock" xmlns:w16se="http://schemas.microsoft.com/office/word/2015/wordml/symex" xmlns:wpg="http://schemas.microsoft.com/office/word/2010/wordprocessingGroup" xmlns:wpi="http://schemas.microsoft.com/office/word/2010/wordprocessingInk" xmlns:wne="http://schemas.microsoft.com/office/word/2006/wordml" xmlns:wps="http://schemas.microsoft.com/office/word/2010/wordprocessingShape" mc:Ignorable="w14 w15 w16se w16cid w16 w16cex w16sdtdh w16sdtfl w16du wp14">
+<w:endnotes xmlns:wpc="http://schemas.microsoft.com/office/word/2010/wordprocessingCanvas" xmlns:cx="http://schemas.microsoft.com/office/drawing/2014/chartex" xmlns:cx1="http://schemas.microsoft.com/office/drawing/2015/9/8/chartex" xmlns:cx2="http://schemas.microsoft.com/office/drawing/2015/10/21/chartex" xmlns:cx3="http://schemas.microsoft.com/office/drawing/2016/5/9/chartex" xmlns:cx4="http://schemas.microsoft.com/office/drawing/2016/5/10/chartex" xmlns:cx5="http://schemas.microsoft.com/office/drawing/2016/5/11/chartex" xmlns:cx6="http://schemas.microsoft.com/office/drawing/2016/5/12/chartex" xmlns:cx7="http://schemas.microsoft.com/office/drawing/2016/5/13/chartex" xmlns:cx8="http://schemas.microsoft.com/office/drawing/2016/5/14/chartex" xmlns:mc="http://schemas.openxmlformats.org/markup-compatibility/2006" xmlns:aink="http://schemas.microsoft.com/office/drawing/2016/ink" xmlns:am3d="http://schemas.microsoft.com/office/drawing/2017/model3d" xmlns:o="urn:schemas-microsoft-com:office:office" xmlns:r="http://schemas.openxmlformats.org/officeDocument/2006/relationships" xmlns:m="http://schemas.openxmlformats.org/officeDocument/2006/math" xmlns:v="urn:schemas-microsoft-com:vml" xmlns:wp14="http://schemas.microsoft.com/office/word/2010/wordprocessingDrawing" xmlns:wp="http://schemas.openxmlformats.org/drawingml/2006/wordprocessingDrawing" xmlns:w10="urn:schemas-microsoft-com:office:word" xmlns:w="http://schemas.openxmlformats.org/wordprocessingml/2006/main" xmlns:w14="http://schemas.microsoft.com/office/word/2010/wordml" xmlns:w15="http://schemas.microsoft.com/office/word/2012/wordml" xmlns:w16cex="http://schemas.microsoft.com/office/word/2018/wordml/cex" xmlns:w16cid="http://schemas.microsoft.com/office/word/2016/wordml/cid" xmlns:w16="http://schemas.microsoft.com/office/word/2018/wordml" xmlns:w16se="http://schemas.microsoft.com/office/word/2015/wordml/symex" xmlns:wpg="http://schemas.microsoft.com/office/word/2010/wordprocessingGroup" xmlns:wpi="http://schemas.microsoft.com/office/word/2010/wordprocessingInk" xmlns:wne="http://schemas.microsoft.com/office/word/2006/wordml" xmlns:wps="http://schemas.microsoft.com/office/word/2010/wordprocessingShape" mc:Ignorable="w14 w15 w16se w16cid w16 w16cex wp14">
   <w:endnote w:type="separator" w:id="-1">
     <w:p>
       <w:pPr>
@@ -3911,7 +3916,7 @@
 </file>
 
 <file path=word/footer1.xml><?xml version="1.0" encoding="utf-8"?>
-<w:ftr xmlns:wpc="http://schemas.microsoft.com/office/word/2010/wordprocessingCanvas" xmlns:cx="http://schemas.microsoft.com/office/drawing/2014/chartex" xmlns:cx1="http://schemas.microsoft.com/office/drawing/2015/9/8/chartex" xmlns:cx2="http://schemas.microsoft.com/office/drawing/2015/10/21/chartex" xmlns:cx3="http://schemas.microsoft.com/office/drawing/2016/5/9/chartex" xmlns:cx4="http://schemas.microsoft.com/office/drawing/2016/5/10/chartex" xmlns:cx5="http://schemas.microsoft.com/office/drawing/2016/5/11/chartex" xmlns:cx6="http://schemas.microsoft.com/office/drawing/2016/5/12/chartex" xmlns:cx7="http://schemas.microsoft.com/office/drawing/2016/5/13/chartex" xmlns:cx8="http://schemas.microsoft.com/office/drawing/2016/5/14/chartex" xmlns:mc="http://schemas.openxmlformats.org/markup-compatibility/2006" xmlns:aink="http://schemas.microsoft.com/office/drawing/2016/ink" xmlns:am3d="http://schemas.microsoft.com/office/drawing/2017/model3d" xmlns:o="urn:schemas-microsoft-com:office:office" xmlns:oel="http://schemas.microsoft.com/office/2019/extlst" xmlns:r="http://schemas.openxmlformats.org/officeDocument/2006/relationships" xmlns:m="http://schemas.openxmlformats.org/officeDocument/2006/math" xmlns:v="urn:schemas-microsoft-com:vml" xmlns:wp14="http://schemas.microsoft.com/office/word/2010/wordprocessingDrawing" xmlns:wp="http://schemas.openxmlformats.org/drawingml/2006/wordprocessingDrawing" xmlns:w10="urn:schemas-microsoft-com:office:word" xmlns:w="http://schemas.openxmlformats.org/wordprocessingml/2006/main" xmlns:w14="http://schemas.microsoft.com/office/word/2010/wordml" xmlns:w15="http://schemas.microsoft.com/office/word/2012/wordml" xmlns:w16cex="http://schemas.microsoft.com/office/word/2018/wordml/cex" xmlns:w16cid="http://schemas.microsoft.com/office/word/2016/wordml/cid" xmlns:w16="http://schemas.microsoft.com/office/word/2018/wordml" xmlns:w16du="http://schemas.microsoft.com/office/word/2023/wordml/word16du" xmlns:w16sdtdh="http://schemas.microsoft.com/office/word/2020/wordml/sdtdatahash" xmlns:w16sdtfl="http://schemas.microsoft.com/office/word/2024/wordml/sdtformatlock" xmlns:w16se="http://schemas.microsoft.com/office/word/2015/wordml/symex" xmlns:wpg="http://schemas.microsoft.com/office/word/2010/wordprocessingGroup" xmlns:wpi="http://schemas.microsoft.com/office/word/2010/wordprocessingInk" xmlns:wne="http://schemas.microsoft.com/office/word/2006/wordml" xmlns:wps="http://schemas.microsoft.com/office/word/2010/wordprocessingShape" mc:Ignorable="w14 w15 w16se w16cid w16 w16cex w16sdtdh w16sdtfl w16du wp14">
+<w:ftr xmlns:wpc="http://schemas.microsoft.com/office/word/2010/wordprocessingCanvas" xmlns:cx="http://schemas.microsoft.com/office/drawing/2014/chartex" xmlns:cx1="http://schemas.microsoft.com/office/drawing/2015/9/8/chartex" xmlns:cx2="http://schemas.microsoft.com/office/drawing/2015/10/21/chartex" xmlns:cx3="http://schemas.microsoft.com/office/drawing/2016/5/9/chartex" xmlns:cx4="http://schemas.microsoft.com/office/drawing/2016/5/10/chartex" xmlns:cx5="http://schemas.microsoft.com/office/drawing/2016/5/11/chartex" xmlns:cx6="http://schemas.microsoft.com/office/drawing/2016/5/12/chartex" xmlns:cx7="http://schemas.microsoft.com/office/drawing/2016/5/13/chartex" xmlns:cx8="http://schemas.microsoft.com/office/drawing/2016/5/14/chartex" xmlns:mc="http://schemas.openxmlformats.org/markup-compatibility/2006" xmlns:aink="http://schemas.microsoft.com/office/drawing/2016/ink" xmlns:am3d="http://schemas.microsoft.com/office/drawing/2017/model3d" xmlns:o="urn:schemas-microsoft-com:office:office" xmlns:r="http://schemas.openxmlformats.org/officeDocument/2006/relationships" xmlns:m="http://schemas.openxmlformats.org/officeDocument/2006/math" xmlns:v="urn:schemas-microsoft-com:vml" xmlns:wp14="http://schemas.microsoft.com/office/word/2010/wordprocessingDrawing" xmlns:wp="http://schemas.openxmlformats.org/drawingml/2006/wordprocessingDrawing" xmlns:w10="urn:schemas-microsoft-com:office:word" xmlns:w="http://schemas.openxmlformats.org/wordprocessingml/2006/main" xmlns:w14="http://schemas.microsoft.com/office/word/2010/wordml" xmlns:w15="http://schemas.microsoft.com/office/word/2012/wordml" xmlns:w16cex="http://schemas.microsoft.com/office/word/2018/wordml/cex" xmlns:w16cid="http://schemas.microsoft.com/office/word/2016/wordml/cid" xmlns:w16="http://schemas.microsoft.com/office/word/2018/wordml" xmlns:w16se="http://schemas.microsoft.com/office/word/2015/wordml/symex" xmlns:wpg="http://schemas.microsoft.com/office/word/2010/wordprocessingGroup" xmlns:wpi="http://schemas.microsoft.com/office/word/2010/wordprocessingInk" xmlns:wne="http://schemas.microsoft.com/office/word/2006/wordml" xmlns:wps="http://schemas.microsoft.com/office/word/2010/wordprocessingShape" mc:Ignorable="w14 w15 w16se w16cid w16 w16cex wp14">
   <w:sdt>
     <w:sdtPr>
       <w:id w:val="-517623792"/>
@@ -3960,7 +3965,7 @@
 </file>
 
 <file path=word/footer2.xml><?xml version="1.0" encoding="utf-8"?>
-<w:ftr xmlns:wpc="http://schemas.microsoft.com/office/word/2010/wordprocessingCanvas" xmlns:cx="http://schemas.microsoft.com/office/drawing/2014/chartex" xmlns:cx1="http://schemas.microsoft.com/office/drawing/2015/9/8/chartex" xmlns:cx2="http://schemas.microsoft.com/office/drawing/2015/10/21/chartex" xmlns:cx3="http://schemas.microsoft.com/office/drawing/2016/5/9/chartex" xmlns:cx4="http://schemas.microsoft.com/office/drawing/2016/5/10/chartex" xmlns:cx5="http://schemas.microsoft.com/office/drawing/2016/5/11/chartex" xmlns:cx6="http://schemas.microsoft.com/office/drawing/2016/5/12/chartex" xmlns:cx7="http://schemas.microsoft.com/office/drawing/2016/5/13/chartex" xmlns:cx8="http://schemas.microsoft.com/office/drawing/2016/5/14/chartex" xmlns:mc="http://schemas.openxmlformats.org/markup-compatibility/2006" xmlns:aink="http://schemas.microsoft.com/office/drawing/2016/ink" xmlns:am3d="http://schemas.microsoft.com/office/drawing/2017/model3d" xmlns:o="urn:schemas-microsoft-com:office:office" xmlns:oel="http://schemas.microsoft.com/office/2019/extlst" xmlns:r="http://schemas.openxmlformats.org/officeDocument/2006/relationships" xmlns:m="http://schemas.openxmlformats.org/officeDocument/2006/math" xmlns:v="urn:schemas-microsoft-com:vml" xmlns:wp14="http://schemas.microsoft.com/office/word/2010/wordprocessingDrawing" xmlns:wp="http://schemas.openxmlformats.org/drawingml/2006/wordprocessingDrawing" xmlns:w10="urn:schemas-microsoft-com:office:word" xmlns:w="http://schemas.openxmlformats.org/wordprocessingml/2006/main" xmlns:w14="http://schemas.microsoft.com/office/word/2010/wordml" xmlns:w15="http://schemas.microsoft.com/office/word/2012/wordml" xmlns:w16cex="http://schemas.microsoft.com/office/word/2018/wordml/cex" xmlns:w16cid="http://schemas.microsoft.com/office/word/2016/wordml/cid" xmlns:w16="http://schemas.microsoft.com/office/word/2018/wordml" xmlns:w16du="http://schemas.microsoft.com/office/word/2023/wordml/word16du" xmlns:w16sdtdh="http://schemas.microsoft.com/office/word/2020/wordml/sdtdatahash" xmlns:w16sdtfl="http://schemas.microsoft.com/office/word/2024/wordml/sdtformatlock" xmlns:w16se="http://schemas.microsoft.com/office/word/2015/wordml/symex" xmlns:wpg="http://schemas.microsoft.com/office/word/2010/wordprocessingGroup" xmlns:wpi="http://schemas.microsoft.com/office/word/2010/wordprocessingInk" xmlns:wne="http://schemas.microsoft.com/office/word/2006/wordml" xmlns:wps="http://schemas.microsoft.com/office/word/2010/wordprocessingShape" mc:Ignorable="w14 w15 w16se w16cid w16 w16cex w16sdtdh w16sdtfl w16du wp14">
+<w:ftr xmlns:wpc="http://schemas.microsoft.com/office/word/2010/wordprocessingCanvas" xmlns:cx="http://schemas.microsoft.com/office/drawing/2014/chartex" xmlns:cx1="http://schemas.microsoft.com/office/drawing/2015/9/8/chartex" xmlns:cx2="http://schemas.microsoft.com/office/drawing/2015/10/21/chartex" xmlns:cx3="http://schemas.microsoft.com/office/drawing/2016/5/9/chartex" xmlns:cx4="http://schemas.microsoft.com/office/drawing/2016/5/10/chartex" xmlns:cx5="http://schemas.microsoft.com/office/drawing/2016/5/11/chartex" xmlns:cx6="http://schemas.microsoft.com/office/drawing/2016/5/12/chartex" xmlns:cx7="http://schemas.microsoft.com/office/drawing/2016/5/13/chartex" xmlns:cx8="http://schemas.microsoft.com/office/drawing/2016/5/14/chartex" xmlns:mc="http://schemas.openxmlformats.org/markup-compatibility/2006" xmlns:aink="http://schemas.microsoft.com/office/drawing/2016/ink" xmlns:am3d="http://schemas.microsoft.com/office/drawing/2017/model3d" xmlns:o="urn:schemas-microsoft-com:office:office" xmlns:r="http://schemas.openxmlformats.org/officeDocument/2006/relationships" xmlns:m="http://schemas.openxmlformats.org/officeDocument/2006/math" xmlns:v="urn:schemas-microsoft-com:vml" xmlns:wp14="http://schemas.microsoft.com/office/word/2010/wordprocessingDrawing" xmlns:wp="http://schemas.openxmlformats.org/drawingml/2006/wordprocessingDrawing" xmlns:w10="urn:schemas-microsoft-com:office:word" xmlns:w="http://schemas.openxmlformats.org/wordprocessingml/2006/main" xmlns:w14="http://schemas.microsoft.com/office/word/2010/wordml" xmlns:w15="http://schemas.microsoft.com/office/word/2012/wordml" xmlns:w16cex="http://schemas.microsoft.com/office/word/2018/wordml/cex" xmlns:w16cid="http://schemas.microsoft.com/office/word/2016/wordml/cid" xmlns:w16="http://schemas.microsoft.com/office/word/2018/wordml" xmlns:w16se="http://schemas.microsoft.com/office/word/2015/wordml/symex" xmlns:wpg="http://schemas.microsoft.com/office/word/2010/wordprocessingGroup" xmlns:wpi="http://schemas.microsoft.com/office/word/2010/wordprocessingInk" xmlns:wne="http://schemas.microsoft.com/office/word/2006/wordml" xmlns:wps="http://schemas.microsoft.com/office/word/2010/wordprocessingShape" mc:Ignorable="w14 w15 w16se w16cid w16 w16cex wp14">
   <w:sdt>
     <w:sdtPr>
       <w:id w:val="-234937495"/>
@@ -4009,7 +4014,7 @@
 </file>
 
 <file path=word/footnotes.xml><?xml version="1.0" encoding="utf-8"?>
-<w:footnotes xmlns:wpc="http://schemas.microsoft.com/office/word/2010/wordprocessingCanvas" xmlns:cx="http://schemas.microsoft.com/office/drawing/2014/chartex" xmlns:cx1="http://schemas.microsoft.com/office/drawing/2015/9/8/chartex" xmlns:cx2="http://schemas.microsoft.com/office/drawing/2015/10/21/chartex" xmlns:cx3="http://schemas.microsoft.com/office/drawing/2016/5/9/chartex" xmlns:cx4="http://schemas.microsoft.com/office/drawing/2016/5/10/chartex" xmlns:cx5="http://schemas.microsoft.com/office/drawing/2016/5/11/chartex" xmlns:cx6="http://schemas.microsoft.com/office/drawing/2016/5/12/chartex" xmlns:cx7="http://schemas.microsoft.com/office/drawing/2016/5/13/chartex" xmlns:cx8="http://schemas.microsoft.com/office/drawing/2016/5/14/chartex" xmlns:mc="http://schemas.openxmlformats.org/markup-compatibility/2006" xmlns:aink="http://schemas.microsoft.com/office/drawing/2016/ink" xmlns:am3d="http://schemas.microsoft.com/office/drawing/2017/model3d" xmlns:o="urn:schemas-microsoft-com:office:office" xmlns:oel="http://schemas.microsoft.com/office/2019/extlst" xmlns:r="http://schemas.openxmlformats.org/officeDocument/2006/relationships" xmlns:m="http://schemas.openxmlformats.org/officeDocument/2006/math" xmlns:v="urn:schemas-microsoft-com:vml" xmlns:wp14="http://schemas.microsoft.com/office/word/2010/wordprocessingDrawing" xmlns:wp="http://schemas.openxmlformats.org/drawingml/2006/wordprocessingDrawing" xmlns:w10="urn:schemas-microsoft-com:office:word" xmlns:w="http://schemas.openxmlformats.org/wordprocessingml/2006/main" xmlns:w14="http://schemas.microsoft.com/office/word/2010/wordml" xmlns:w15="http://schemas.microsoft.com/office/word/2012/wordml" xmlns:w16cex="http://schemas.microsoft.com/office/word/2018/wordml/cex" xmlns:w16cid="http://schemas.microsoft.com/office/word/2016/wordml/cid" xmlns:w16="http://schemas.microsoft.com/office/word/2018/wordml" xmlns:w16du="http://schemas.microsoft.com/office/word/2023/wordml/word16du" xmlns:w16sdtdh="http://schemas.microsoft.com/office/word/2020/wordml/sdtdatahash" xmlns:w16sdtfl="http://schemas.microsoft.com/office/word/2024/wordml/sdtformatlock" xmlns:w16se="http://schemas.microsoft.com/office/word/2015/wordml/symex" xmlns:wpg="http://schemas.microsoft.com/office/word/2010/wordprocessingGroup" xmlns:wpi="http://schemas.microsoft.com/office/word/2010/wordprocessingInk" xmlns:wne="http://schemas.microsoft.com/office/word/2006/wordml" xmlns:wps="http://schemas.microsoft.com/office/word/2010/wordprocessingShape" mc:Ignorable="w14 w15 w16se w16cid w16 w16cex w16sdtdh w16sdtfl w16du wp14">
+<w:footnotes xmlns:wpc="http://schemas.microsoft.com/office/word/2010/wordprocessingCanvas" xmlns:cx="http://schemas.microsoft.com/office/drawing/2014/chartex" xmlns:cx1="http://schemas.microsoft.com/office/drawing/2015/9/8/chartex" xmlns:cx2="http://schemas.microsoft.com/office/drawing/2015/10/21/chartex" xmlns:cx3="http://schemas.microsoft.com/office/drawing/2016/5/9/chartex" xmlns:cx4="http://schemas.microsoft.com/office/drawing/2016/5/10/chartex" xmlns:cx5="http://schemas.microsoft.com/office/drawing/2016/5/11/chartex" xmlns:cx6="http://schemas.microsoft.com/office/drawing/2016/5/12/chartex" xmlns:cx7="http://schemas.microsoft.com/office/drawing/2016/5/13/chartex" xmlns:cx8="http://schemas.microsoft.com/office/drawing/2016/5/14/chartex" xmlns:mc="http://schemas.openxmlformats.org/markup-compatibility/2006" xmlns:aink="http://schemas.microsoft.com/office/drawing/2016/ink" xmlns:am3d="http://schemas.microsoft.com/office/drawing/2017/model3d" xmlns:o="urn:schemas-microsoft-com:office:office" xmlns:r="http://schemas.openxmlformats.org/officeDocument/2006/relationships" xmlns:m="http://schemas.openxmlformats.org/officeDocument/2006/math" xmlns:v="urn:schemas-microsoft-com:vml" xmlns:wp14="http://schemas.microsoft.com/office/word/2010/wordprocessingDrawing" xmlns:wp="http://schemas.openxmlformats.org/drawingml/2006/wordprocessingDrawing" xmlns:w10="urn:schemas-microsoft-com:office:word" xmlns:w="http://schemas.openxmlformats.org/wordprocessingml/2006/main" xmlns:w14="http://schemas.microsoft.com/office/word/2010/wordml" xmlns:w15="http://schemas.microsoft.com/office/word/2012/wordml" xmlns:w16cex="http://schemas.microsoft.com/office/word/2018/wordml/cex" xmlns:w16cid="http://schemas.microsoft.com/office/word/2016/wordml/cid" xmlns:w16="http://schemas.microsoft.com/office/word/2018/wordml" xmlns:w16se="http://schemas.microsoft.com/office/word/2015/wordml/symex" xmlns:wpg="http://schemas.microsoft.com/office/word/2010/wordprocessingGroup" xmlns:wpi="http://schemas.microsoft.com/office/word/2010/wordprocessingInk" xmlns:wne="http://schemas.microsoft.com/office/word/2006/wordml" xmlns:wps="http://schemas.microsoft.com/office/word/2010/wordprocessingShape" mc:Ignorable="w14 w15 w16se w16cid w16 w16cex wp14">
   <w:footnote w:type="separator" w:id="-1">
     <w:p>
       <w:pPr>
@@ -4036,7 +4041,7 @@
 </file>
 
 <file path=word/numbering.xml><?xml version="1.0" encoding="utf-8"?>
-<w:numbering xmlns:wpc="http://schemas.microsoft.com/office/word/2010/wordprocessingCanvas" xmlns:cx="http://schemas.microsoft.com/office/drawing/2014/chartex" xmlns:cx1="http://schemas.microsoft.com/office/drawing/2015/9/8/chartex" xmlns:cx2="http://schemas.microsoft.com/office/drawing/2015/10/21/chartex" xmlns:cx3="http://schemas.microsoft.com/office/drawing/2016/5/9/chartex" xmlns:cx4="http://schemas.microsoft.com/office/drawing/2016/5/10/chartex" xmlns:cx5="http://schemas.microsoft.com/office/drawing/2016/5/11/chartex" xmlns:cx6="http://schemas.microsoft.com/office/drawing/2016/5/12/chartex" xmlns:cx7="http://schemas.microsoft.com/office/drawing/2016/5/13/chartex" xmlns:cx8="http://schemas.microsoft.com/office/drawing/2016/5/14/chartex" xmlns:mc="http://schemas.openxmlformats.org/markup-compatibility/2006" xmlns:aink="http://schemas.microsoft.com/office/drawing/2016/ink" xmlns:am3d="http://schemas.microsoft.com/office/drawing/2017/model3d" xmlns:o="urn:schemas-microsoft-com:office:office" xmlns:oel="http://schemas.microsoft.com/office/2019/extlst" xmlns:r="http://schemas.openxmlformats.org/officeDocument/2006/relationships" xmlns:m="http://schemas.openxmlformats.org/officeDocument/2006/math" xmlns:v="urn:schemas-microsoft-com:vml" xmlns:wp14="http://schemas.microsoft.com/office/word/2010/wordprocessingDrawing" xmlns:wp="http://schemas.openxmlformats.org/drawingml/2006/wordprocessingDrawing" xmlns:w10="urn:schemas-microsoft-com:office:word" xmlns:w="http://schemas.openxmlformats.org/wordprocessingml/2006/main" xmlns:w14="http://schemas.microsoft.com/office/word/2010/wordml" xmlns:w15="http://schemas.microsoft.com/office/word/2012/wordml" xmlns:w16cex="http://schemas.microsoft.com/office/word/2018/wordml/cex" xmlns:w16cid="http://schemas.microsoft.com/office/word/2016/wordml/cid" xmlns:w16="http://schemas.microsoft.com/office/word/2018/wordml" xmlns:w16du="http://schemas.microsoft.com/office/word/2023/wordml/word16du" xmlns:w16sdtdh="http://schemas.microsoft.com/office/word/2020/wordml/sdtdatahash" xmlns:w16sdtfl="http://schemas.microsoft.com/office/word/2024/wordml/sdtformatlock" xmlns:w16se="http://schemas.microsoft.com/office/word/2015/wordml/symex" xmlns:wpg="http://schemas.microsoft.com/office/word/2010/wordprocessingGroup" xmlns:wpi="http://schemas.microsoft.com/office/word/2010/wordprocessingInk" xmlns:wne="http://schemas.microsoft.com/office/word/2006/wordml" xmlns:wps="http://schemas.microsoft.com/office/word/2010/wordprocessingShape" mc:Ignorable="w14 w15 w16se w16cid w16 w16cex w16sdtdh w16sdtfl w16du wp14">
+<w:numbering xmlns:wpc="http://schemas.microsoft.com/office/word/2010/wordprocessingCanvas" xmlns:cx="http://schemas.microsoft.com/office/drawing/2014/chartex" xmlns:cx1="http://schemas.microsoft.com/office/drawing/2015/9/8/chartex" xmlns:cx2="http://schemas.microsoft.com/office/drawing/2015/10/21/chartex" xmlns:cx3="http://schemas.microsoft.com/office/drawing/2016/5/9/chartex" xmlns:cx4="http://schemas.microsoft.com/office/drawing/2016/5/10/chartex" xmlns:cx5="http://schemas.microsoft.com/office/drawing/2016/5/11/chartex" xmlns:cx6="http://schemas.microsoft.com/office/drawing/2016/5/12/chartex" xmlns:cx7="http://schemas.microsoft.com/office/drawing/2016/5/13/chartex" xmlns:cx8="http://schemas.microsoft.com/office/drawing/2016/5/14/chartex" xmlns:mc="http://schemas.openxmlformats.org/markup-compatibility/2006" xmlns:aink="http://schemas.microsoft.com/office/drawing/2016/ink" xmlns:am3d="http://schemas.microsoft.com/office/drawing/2017/model3d" xmlns:o="urn:schemas-microsoft-com:office:office" xmlns:r="http://schemas.openxmlformats.org/officeDocument/2006/relationships" xmlns:m="http://schemas.openxmlformats.org/officeDocument/2006/math" xmlns:v="urn:schemas-microsoft-com:vml" xmlns:wp14="http://schemas.microsoft.com/office/word/2010/wordprocessingDrawing" xmlns:wp="http://schemas.openxmlformats.org/drawingml/2006/wordprocessingDrawing" xmlns:w10="urn:schemas-microsoft-com:office:word" xmlns:w="http://schemas.openxmlformats.org/wordprocessingml/2006/main" xmlns:w14="http://schemas.microsoft.com/office/word/2010/wordml" xmlns:w15="http://schemas.microsoft.com/office/word/2012/wordml" xmlns:w16cex="http://schemas.microsoft.com/office/word/2018/wordml/cex" xmlns:w16cid="http://schemas.microsoft.com/office/word/2016/wordml/cid" xmlns:w16="http://schemas.microsoft.com/office/word/2018/wordml" xmlns:w16se="http://schemas.microsoft.com/office/word/2015/wordml/symex" xmlns:wpg="http://schemas.microsoft.com/office/word/2010/wordprocessingGroup" xmlns:wpi="http://schemas.microsoft.com/office/word/2010/wordprocessingInk" xmlns:wne="http://schemas.microsoft.com/office/word/2006/wordml" xmlns:wps="http://schemas.microsoft.com/office/word/2010/wordprocessingShape" mc:Ignorable="w14 w15 w16se w16cid w16 w16cex wp14">
   <w:abstractNum w:abstractNumId="0" w15:restartNumberingAfterBreak="0">
     <w:nsid w:val="01344BC1"/>
     <w:multiLevelType w:val="hybridMultilevel"/>
@@ -7036,106 +7041,106 @@
       </w:pPr>
     </w:lvl>
   </w:abstractNum>
-  <w:num w:numId="1" w16cid:durableId="210578805">
+  <w:num w:numId="1">
     <w:abstractNumId w:val="31"/>
   </w:num>
-  <w:num w:numId="2" w16cid:durableId="406000387">
+  <w:num w:numId="2">
     <w:abstractNumId w:val="25"/>
   </w:num>
-  <w:num w:numId="3" w16cid:durableId="600065997">
+  <w:num w:numId="3">
     <w:abstractNumId w:val="10"/>
   </w:num>
-  <w:num w:numId="4" w16cid:durableId="1352803040">
+  <w:num w:numId="4">
     <w:abstractNumId w:val="9"/>
   </w:num>
-  <w:num w:numId="5" w16cid:durableId="887885926">
+  <w:num w:numId="5">
     <w:abstractNumId w:val="22"/>
   </w:num>
-  <w:num w:numId="6" w16cid:durableId="1813591787">
+  <w:num w:numId="6">
     <w:abstractNumId w:val="2"/>
   </w:num>
-  <w:num w:numId="7" w16cid:durableId="1466465247">
+  <w:num w:numId="7">
     <w:abstractNumId w:val="32"/>
   </w:num>
-  <w:num w:numId="8" w16cid:durableId="1307709996">
+  <w:num w:numId="8">
     <w:abstractNumId w:val="7"/>
   </w:num>
-  <w:num w:numId="9" w16cid:durableId="1378316580">
+  <w:num w:numId="9">
     <w:abstractNumId w:val="0"/>
   </w:num>
-  <w:num w:numId="10" w16cid:durableId="326371980">
+  <w:num w:numId="10">
     <w:abstractNumId w:val="1"/>
   </w:num>
-  <w:num w:numId="11" w16cid:durableId="550001384">
+  <w:num w:numId="11">
     <w:abstractNumId w:val="14"/>
   </w:num>
-  <w:num w:numId="12" w16cid:durableId="2127192152">
+  <w:num w:numId="12">
     <w:abstractNumId w:val="21"/>
   </w:num>
-  <w:num w:numId="13" w16cid:durableId="1451164914">
+  <w:num w:numId="13">
     <w:abstractNumId w:val="17"/>
   </w:num>
-  <w:num w:numId="14" w16cid:durableId="1819613525">
+  <w:num w:numId="14">
     <w:abstractNumId w:val="30"/>
   </w:num>
-  <w:num w:numId="15" w16cid:durableId="495389900">
+  <w:num w:numId="15">
     <w:abstractNumId w:val="28"/>
   </w:num>
-  <w:num w:numId="16" w16cid:durableId="38821461">
+  <w:num w:numId="16">
     <w:abstractNumId w:val="4"/>
   </w:num>
-  <w:num w:numId="17" w16cid:durableId="414323815">
+  <w:num w:numId="17">
     <w:abstractNumId w:val="3"/>
   </w:num>
-  <w:num w:numId="18" w16cid:durableId="1324776346">
+  <w:num w:numId="18">
     <w:abstractNumId w:val="26"/>
   </w:num>
-  <w:num w:numId="19" w16cid:durableId="2126725287">
+  <w:num w:numId="19">
     <w:abstractNumId w:val="19"/>
   </w:num>
-  <w:num w:numId="20" w16cid:durableId="1199926710">
+  <w:num w:numId="20">
     <w:abstractNumId w:val="15"/>
   </w:num>
-  <w:num w:numId="21" w16cid:durableId="269899252">
+  <w:num w:numId="21">
     <w:abstractNumId w:val="5"/>
   </w:num>
-  <w:num w:numId="22" w16cid:durableId="711199235">
+  <w:num w:numId="22">
     <w:abstractNumId w:val="6"/>
   </w:num>
-  <w:num w:numId="23" w16cid:durableId="311983057">
+  <w:num w:numId="23">
     <w:abstractNumId w:val="20"/>
   </w:num>
-  <w:num w:numId="24" w16cid:durableId="987788108">
+  <w:num w:numId="24">
     <w:abstractNumId w:val="13"/>
   </w:num>
-  <w:num w:numId="25" w16cid:durableId="1005740174">
+  <w:num w:numId="25">
     <w:abstractNumId w:val="18"/>
   </w:num>
-  <w:num w:numId="26" w16cid:durableId="1426417247">
+  <w:num w:numId="26">
     <w:abstractNumId w:val="11"/>
   </w:num>
-  <w:num w:numId="27" w16cid:durableId="1572958393">
+  <w:num w:numId="27">
     <w:abstractNumId w:val="27"/>
   </w:num>
-  <w:num w:numId="28" w16cid:durableId="1422531774">
+  <w:num w:numId="28">
     <w:abstractNumId w:val="23"/>
   </w:num>
-  <w:num w:numId="29" w16cid:durableId="822549290">
+  <w:num w:numId="29">
     <w:abstractNumId w:val="16"/>
   </w:num>
-  <w:num w:numId="30" w16cid:durableId="174654104">
+  <w:num w:numId="30">
     <w:abstractNumId w:val="24"/>
   </w:num>
-  <w:num w:numId="31" w16cid:durableId="1494292675">
+  <w:num w:numId="31">
     <w:abstractNumId w:val="33"/>
   </w:num>
-  <w:num w:numId="32" w16cid:durableId="24066755">
+  <w:num w:numId="32">
     <w:abstractNumId w:val="12"/>
   </w:num>
-  <w:num w:numId="33" w16cid:durableId="831066050">
+  <w:num w:numId="33">
     <w:abstractNumId w:val="8"/>
   </w:num>
-  <w:num w:numId="34" w16cid:durableId="402724105">
+  <w:num w:numId="34">
     <w:abstractNumId w:val="29"/>
   </w:num>
   <w:numIdMacAtCleanup w:val="2"/>
@@ -7143,7 +7148,7 @@
 </file>
 
 <file path=word/styles.xml><?xml version="1.0" encoding="utf-8"?>
-<w:styles xmlns:mc="http://schemas.openxmlformats.org/markup-compatibility/2006" xmlns:r="http://schemas.openxmlformats.org/officeDocument/2006/relationships" xmlns:w="http://schemas.openxmlformats.org/wordprocessingml/2006/main" xmlns:w14="http://schemas.microsoft.com/office/word/2010/wordml" xmlns:w15="http://schemas.microsoft.com/office/word/2012/wordml" xmlns:w16cex="http://schemas.microsoft.com/office/word/2018/wordml/cex" xmlns:w16cid="http://schemas.microsoft.com/office/word/2016/wordml/cid" xmlns:w16="http://schemas.microsoft.com/office/word/2018/wordml" xmlns:w16du="http://schemas.microsoft.com/office/word/2023/wordml/word16du" xmlns:w16sdtdh="http://schemas.microsoft.com/office/word/2020/wordml/sdtdatahash" xmlns:w16sdtfl="http://schemas.microsoft.com/office/word/2024/wordml/sdtformatlock" xmlns:w16se="http://schemas.microsoft.com/office/word/2015/wordml/symex" mc:Ignorable="w14 w15 w16se w16cid w16 w16cex w16sdtdh w16sdtfl w16du">
+<w:styles xmlns:mc="http://schemas.openxmlformats.org/markup-compatibility/2006" xmlns:r="http://schemas.openxmlformats.org/officeDocument/2006/relationships" xmlns:w="http://schemas.openxmlformats.org/wordprocessingml/2006/main" xmlns:w14="http://schemas.microsoft.com/office/word/2010/wordml" xmlns:w15="http://schemas.microsoft.com/office/word/2012/wordml" xmlns:w16cex="http://schemas.microsoft.com/office/word/2018/wordml/cex" xmlns:w16cid="http://schemas.microsoft.com/office/word/2016/wordml/cid" xmlns:w16="http://schemas.microsoft.com/office/word/2018/wordml" xmlns:w16se="http://schemas.microsoft.com/office/word/2015/wordml/symex" mc:Ignorable="w14 w15 w16se w16cid w16 w16cex">
   <w:docDefaults>
     <w:rPrDefault>
       <w:rPr>

</xml_diff>

<commit_message>
update v4.2.6 'bug fixed, penomoran gambar pada bab 1 format-2.docx'
</commit_message>
<xml_diff>
--- a/kuliah/DocumentGenerator_Laporan_Praktikum/src/templates/format-2.docx
+++ b/kuliah/DocumentGenerator_Laporan_Praktikum/src/templates/format-2.docx
@@ -3273,19 +3273,7 @@
         <w:rPr>
           <w:lang w:val="en-US"/>
         </w:rPr>
-        <w:t>{% for gbr in item.list_gambar %}</w:t>
-      </w:r>
-      <w:r>
-        <w:rPr>
-          <w:lang w:val="en-US"/>
-        </w:rPr>
-        <w:t xml:space="preserve"> </w:t>
-      </w:r>
-      <w:r>
-        <w:rPr>
-          <w:lang w:val="en-US"/>
-        </w:rPr>
-        <w:t>{{ gbr.objek_gambar }}</w:t>
+        <w:t>{% for gbr in item.list_gambar %} {{ gbr.objek_gambar }}</w:t>
       </w:r>
     </w:p>
     <w:p>
@@ -3296,18 +3284,23 @@
       </w:pPr>
       <w:bookmarkStart w:id="2" w:name="_Toc221452899"/>
       <w:r>
-        <w:t>Gambar 1.{{ loop.index }} {{ gbr.caption }</w:t>
-      </w:r>
-      <w:r>
-        <w:t>}</w:t>
+        <w:t>Gambar 1.{{ gbr.nomor_tampil}} {{ gbr.caption }}</w:t>
       </w:r>
       <w:bookmarkEnd w:id="2"/>
     </w:p>
     <w:p>
       <w:pPr>
         <w:ind w:left="1021"/>
-      </w:pPr>
-      <w:r>
+        <w:rPr>
+          <w:sz w:val="6"/>
+          <w:szCs w:val="6"/>
+        </w:rPr>
+      </w:pPr>
+      <w:r>
+        <w:rPr>
+          <w:sz w:val="6"/>
+          <w:szCs w:val="6"/>
+        </w:rPr>
         <w:t>{% endfor %}</w:t>
       </w:r>
     </w:p>

</xml_diff>